<commit_message>
Updated files from current Spanish folder on Teams
Updated files from current Teams folder - slides, Refinement, etc.
</commit_message>
<xml_diff>
--- a/training/Latin American Spanish (es-419)/Tutoriales - es [COBT-T]/01b Los 6 Comportamientos de TBPI.docx
+++ b/training/Latin American Spanish (es-419)/Tutoriales - es [COBT-T]/01b Los 6 Comportamientos de TBPI.docx
@@ -1,6 +1,6 @@
 
 <file path=word/document.xml><?xml version="1.0" encoding="utf-8"?>
-<w:document xmlns:wpc="http://schemas.microsoft.com/office/word/2010/wordprocessingCanvas" xmlns:cx="http://schemas.microsoft.com/office/drawing/2014/chartex" xmlns:cx1="http://schemas.microsoft.com/office/drawing/2015/9/8/chartex" xmlns:cx2="http://schemas.microsoft.com/office/drawing/2015/10/21/chartex" xmlns:cx3="http://schemas.microsoft.com/office/drawing/2016/5/9/chartex" xmlns:cx4="http://schemas.microsoft.com/office/drawing/2016/5/10/chartex" xmlns:cx5="http://schemas.microsoft.com/office/drawing/2016/5/11/chartex" xmlns:cx6="http://schemas.microsoft.com/office/drawing/2016/5/12/chartex" xmlns:cx7="http://schemas.microsoft.com/office/drawing/2016/5/13/chartex" xmlns:cx8="http://schemas.microsoft.com/office/drawing/2016/5/14/chartex" xmlns:mc="http://schemas.openxmlformats.org/markup-compatibility/2006" xmlns:aink="http://schemas.microsoft.com/office/drawing/2016/ink" xmlns:am3d="http://schemas.microsoft.com/office/drawing/2017/model3d" xmlns:o="urn:schemas-microsoft-com:office:office" xmlns:oel="http://schemas.microsoft.com/office/2019/extlst" xmlns:r="http://schemas.openxmlformats.org/officeDocument/2006/relationships" xmlns:m="http://schemas.openxmlformats.org/officeDocument/2006/math" xmlns:v="urn:schemas-microsoft-com:vml" xmlns:wp14="http://schemas.microsoft.com/office/word/2010/wordprocessingDrawing" xmlns:wp="http://schemas.openxmlformats.org/drawingml/2006/wordprocessingDrawing" xmlns:w10="urn:schemas-microsoft-com:office:word" xmlns:w="http://schemas.openxmlformats.org/wordprocessingml/2006/main" xmlns:w14="http://schemas.microsoft.com/office/word/2010/wordml" xmlns:w15="http://schemas.microsoft.com/office/word/2012/wordml" xmlns:w16cex="http://schemas.microsoft.com/office/word/2018/wordml/cex" xmlns:w16cid="http://schemas.microsoft.com/office/word/2016/wordml/cid" xmlns:w16="http://schemas.microsoft.com/office/word/2018/wordml" xmlns:w16sdtdh="http://schemas.microsoft.com/office/word/2020/wordml/sdtdatahash" xmlns:w16se="http://schemas.microsoft.com/office/word/2015/wordml/symex" xmlns:wpg="http://schemas.microsoft.com/office/word/2010/wordprocessingGroup" xmlns:wpi="http://schemas.microsoft.com/office/word/2010/wordprocessingInk" xmlns:wne="http://schemas.microsoft.com/office/word/2006/wordml" xmlns:wps="http://schemas.microsoft.com/office/word/2010/wordprocessingShape" mc:Ignorable="w14 w15 w16se w16cid w16 w16cex w16sdtdh wp14">
+<w:document xmlns:wpc="http://schemas.microsoft.com/office/word/2010/wordprocessingCanvas" xmlns:cx="http://schemas.microsoft.com/office/drawing/2014/chartex" xmlns:cx1="http://schemas.microsoft.com/office/drawing/2015/9/8/chartex" xmlns:cx2="http://schemas.microsoft.com/office/drawing/2015/10/21/chartex" xmlns:cx3="http://schemas.microsoft.com/office/drawing/2016/5/9/chartex" xmlns:cx4="http://schemas.microsoft.com/office/drawing/2016/5/10/chartex" xmlns:cx5="http://schemas.microsoft.com/office/drawing/2016/5/11/chartex" xmlns:cx6="http://schemas.microsoft.com/office/drawing/2016/5/12/chartex" xmlns:cx7="http://schemas.microsoft.com/office/drawing/2016/5/13/chartex" xmlns:cx8="http://schemas.microsoft.com/office/drawing/2016/5/14/chartex" xmlns:mc="http://schemas.openxmlformats.org/markup-compatibility/2006" xmlns:aink="http://schemas.microsoft.com/office/drawing/2016/ink" xmlns:am3d="http://schemas.microsoft.com/office/drawing/2017/model3d" xmlns:o="urn:schemas-microsoft-com:office:office" xmlns:oel="http://schemas.microsoft.com/office/2019/extlst" xmlns:r="http://schemas.openxmlformats.org/officeDocument/2006/relationships" xmlns:m="http://schemas.openxmlformats.org/officeDocument/2006/math" xmlns:v="urn:schemas-microsoft-com:vml" xmlns:wp14="http://schemas.microsoft.com/office/word/2010/wordprocessingDrawing" xmlns:wp="http://schemas.openxmlformats.org/drawingml/2006/wordprocessingDrawing" xmlns:w10="urn:schemas-microsoft-com:office:word" xmlns:w="http://schemas.openxmlformats.org/wordprocessingml/2006/main" xmlns:w14="http://schemas.microsoft.com/office/word/2010/wordml" xmlns:w15="http://schemas.microsoft.com/office/word/2012/wordml" xmlns:w16cex="http://schemas.microsoft.com/office/word/2018/wordml/cex" xmlns:w16cid="http://schemas.microsoft.com/office/word/2016/wordml/cid" xmlns:w16="http://schemas.microsoft.com/office/word/2018/wordml" xmlns:w16du="http://schemas.microsoft.com/office/word/2023/wordml/word16du" xmlns:w16sdtdh="http://schemas.microsoft.com/office/word/2020/wordml/sdtdatahash" xmlns:w16sdtfl="http://schemas.microsoft.com/office/word/2024/wordml/sdtformatlock" xmlns:w16se="http://schemas.microsoft.com/office/word/2015/wordml/symex" xmlns:wpg="http://schemas.microsoft.com/office/word/2010/wordprocessingGroup" xmlns:wpi="http://schemas.microsoft.com/office/word/2010/wordprocessingInk" xmlns:wne="http://schemas.microsoft.com/office/word/2006/wordml" xmlns:wps="http://schemas.microsoft.com/office/word/2010/wordprocessingShape" mc:Ignorable="w14 w15 w16se w16cid w16 w16cex w16sdtdh w16sdtfl w16du wp14">
   <w:body>
     <w:p>
       <w:pPr>
@@ -3176,12 +3176,12 @@
       </w:r>
     </w:p>
     <w:sectPr>
-      <w:headerReference w:type="even" r:id="rId11"/>
-      <w:headerReference w:type="default" r:id="rId12"/>
-      <w:footerReference w:type="even" r:id="rId13"/>
-      <w:footerReference w:type="default" r:id="rId14"/>
-      <w:headerReference w:type="first" r:id="rId15"/>
-      <w:footerReference w:type="first" r:id="rId16"/>
+      <w:headerReference w:type="even" r:id="rId14"/>
+      <w:headerReference w:type="default" r:id="rId15"/>
+      <w:footerReference w:type="even" r:id="rId16"/>
+      <w:footerReference w:type="default" r:id="rId17"/>
+      <w:headerReference w:type="first" r:id="rId18"/>
+      <w:footerReference w:type="first" r:id="rId19"/>
       <w:pgSz w:w="12240" w:h="15840"/>
       <w:pgMar w:top="1440" w:right="1440" w:bottom="1440" w:left="1440" w:header="720" w:footer="720" w:gutter="0"/>
       <w:cols w:space="720"/>
@@ -3192,7 +3192,7 @@
 </file>
 
 <file path=word/comments.xml><?xml version="1.0" encoding="utf-8"?>
-<w:comments xmlns:wpc="http://schemas.microsoft.com/office/word/2010/wordprocessingCanvas" xmlns:cx="http://schemas.microsoft.com/office/drawing/2014/chartex" xmlns:cx1="http://schemas.microsoft.com/office/drawing/2015/9/8/chartex" xmlns:cx2="http://schemas.microsoft.com/office/drawing/2015/10/21/chartex" xmlns:cx3="http://schemas.microsoft.com/office/drawing/2016/5/9/chartex" xmlns:cx4="http://schemas.microsoft.com/office/drawing/2016/5/10/chartex" xmlns:cx5="http://schemas.microsoft.com/office/drawing/2016/5/11/chartex" xmlns:cx6="http://schemas.microsoft.com/office/drawing/2016/5/12/chartex" xmlns:cx7="http://schemas.microsoft.com/office/drawing/2016/5/13/chartex" xmlns:cx8="http://schemas.microsoft.com/office/drawing/2016/5/14/chartex" xmlns:mc="http://schemas.openxmlformats.org/markup-compatibility/2006" xmlns:aink="http://schemas.microsoft.com/office/drawing/2016/ink" xmlns:am3d="http://schemas.microsoft.com/office/drawing/2017/model3d" xmlns:o="urn:schemas-microsoft-com:office:office" xmlns:oel="http://schemas.microsoft.com/office/2019/extlst" xmlns:r="http://schemas.openxmlformats.org/officeDocument/2006/relationships" xmlns:m="http://schemas.openxmlformats.org/officeDocument/2006/math" xmlns:v="urn:schemas-microsoft-com:vml" xmlns:wp14="http://schemas.microsoft.com/office/word/2010/wordprocessingDrawing" xmlns:wp="http://schemas.openxmlformats.org/drawingml/2006/wordprocessingDrawing" xmlns:w10="urn:schemas-microsoft-com:office:word" xmlns:w="http://schemas.openxmlformats.org/wordprocessingml/2006/main" xmlns:w14="http://schemas.microsoft.com/office/word/2010/wordml" xmlns:w15="http://schemas.microsoft.com/office/word/2012/wordml" xmlns:w16cex="http://schemas.microsoft.com/office/word/2018/wordml/cex" xmlns:w16cid="http://schemas.microsoft.com/office/word/2016/wordml/cid" xmlns:w16="http://schemas.microsoft.com/office/word/2018/wordml" xmlns:w16sdtdh="http://schemas.microsoft.com/office/word/2020/wordml/sdtdatahash" xmlns:w16se="http://schemas.microsoft.com/office/word/2015/wordml/symex" xmlns:wpg="http://schemas.microsoft.com/office/word/2010/wordprocessingGroup" xmlns:wpi="http://schemas.microsoft.com/office/word/2010/wordprocessingInk" xmlns:wne="http://schemas.microsoft.com/office/word/2006/wordml" xmlns:wps="http://schemas.microsoft.com/office/word/2010/wordprocessingShape" mc:Ignorable="w14 w15 w16se w16cid w16 w16cex w16sdtdh wp14">
+<w:comments xmlns:wpc="http://schemas.microsoft.com/office/word/2010/wordprocessingCanvas" xmlns:cx="http://schemas.microsoft.com/office/drawing/2014/chartex" xmlns:cx1="http://schemas.microsoft.com/office/drawing/2015/9/8/chartex" xmlns:cx2="http://schemas.microsoft.com/office/drawing/2015/10/21/chartex" xmlns:cx3="http://schemas.microsoft.com/office/drawing/2016/5/9/chartex" xmlns:cx4="http://schemas.microsoft.com/office/drawing/2016/5/10/chartex" xmlns:cx5="http://schemas.microsoft.com/office/drawing/2016/5/11/chartex" xmlns:cx6="http://schemas.microsoft.com/office/drawing/2016/5/12/chartex" xmlns:cx7="http://schemas.microsoft.com/office/drawing/2016/5/13/chartex" xmlns:cx8="http://schemas.microsoft.com/office/drawing/2016/5/14/chartex" xmlns:mc="http://schemas.openxmlformats.org/markup-compatibility/2006" xmlns:aink="http://schemas.microsoft.com/office/drawing/2016/ink" xmlns:am3d="http://schemas.microsoft.com/office/drawing/2017/model3d" xmlns:o="urn:schemas-microsoft-com:office:office" xmlns:oel="http://schemas.microsoft.com/office/2019/extlst" xmlns:r="http://schemas.openxmlformats.org/officeDocument/2006/relationships" xmlns:m="http://schemas.openxmlformats.org/officeDocument/2006/math" xmlns:v="urn:schemas-microsoft-com:vml" xmlns:wp14="http://schemas.microsoft.com/office/word/2010/wordprocessingDrawing" xmlns:wp="http://schemas.openxmlformats.org/drawingml/2006/wordprocessingDrawing" xmlns:w10="urn:schemas-microsoft-com:office:word" xmlns:w="http://schemas.openxmlformats.org/wordprocessingml/2006/main" xmlns:w14="http://schemas.microsoft.com/office/word/2010/wordml" xmlns:w15="http://schemas.microsoft.com/office/word/2012/wordml" xmlns:w16cex="http://schemas.microsoft.com/office/word/2018/wordml/cex" xmlns:w16cid="http://schemas.microsoft.com/office/word/2016/wordml/cid" xmlns:w16="http://schemas.microsoft.com/office/word/2018/wordml" xmlns:w16du="http://schemas.microsoft.com/office/word/2023/wordml/word16du" xmlns:w16sdtdh="http://schemas.microsoft.com/office/word/2020/wordml/sdtdatahash" xmlns:w16sdtfl="http://schemas.microsoft.com/office/word/2024/wordml/sdtformatlock" xmlns:w16se="http://schemas.microsoft.com/office/word/2015/wordml/symex" xmlns:wpg="http://schemas.microsoft.com/office/word/2010/wordprocessingGroup" xmlns:wpi="http://schemas.microsoft.com/office/word/2010/wordprocessingInk" xmlns:wne="http://schemas.microsoft.com/office/word/2006/wordml" xmlns:wps="http://schemas.microsoft.com/office/word/2010/wordprocessingShape" mc:Ignorable="w14 w15 w16se w16cid w16 w16cex w16sdtdh w16sdtfl w16du wp14">
   <w:comment w:id="0" w:author="Tammy Enns" w:date="2023-10-23T15:36:00Z" w:initials="TE">
     <w:p>
       <w:r>
@@ -3215,25 +3215,25 @@
 </file>
 
 <file path=word/commentsExtended.xml><?xml version="1.0" encoding="utf-8"?>
-<w15:commentsEx xmlns:wpc="http://schemas.microsoft.com/office/word/2010/wordprocessingCanvas" xmlns:cx="http://schemas.microsoft.com/office/drawing/2014/chartex" xmlns:cx1="http://schemas.microsoft.com/office/drawing/2015/9/8/chartex" xmlns:cx2="http://schemas.microsoft.com/office/drawing/2015/10/21/chartex" xmlns:cx3="http://schemas.microsoft.com/office/drawing/2016/5/9/chartex" xmlns:cx4="http://schemas.microsoft.com/office/drawing/2016/5/10/chartex" xmlns:cx5="http://schemas.microsoft.com/office/drawing/2016/5/11/chartex" xmlns:cx6="http://schemas.microsoft.com/office/drawing/2016/5/12/chartex" xmlns:cx7="http://schemas.microsoft.com/office/drawing/2016/5/13/chartex" xmlns:cx8="http://schemas.microsoft.com/office/drawing/2016/5/14/chartex" xmlns:mc="http://schemas.openxmlformats.org/markup-compatibility/2006" xmlns:aink="http://schemas.microsoft.com/office/drawing/2016/ink" xmlns:am3d="http://schemas.microsoft.com/office/drawing/2017/model3d" xmlns:o="urn:schemas-microsoft-com:office:office" xmlns:oel="http://schemas.microsoft.com/office/2019/extlst" xmlns:r="http://schemas.openxmlformats.org/officeDocument/2006/relationships" xmlns:m="http://schemas.openxmlformats.org/officeDocument/2006/math" xmlns:v="urn:schemas-microsoft-com:vml" xmlns:wp14="http://schemas.microsoft.com/office/word/2010/wordprocessingDrawing" xmlns:wp="http://schemas.openxmlformats.org/drawingml/2006/wordprocessingDrawing" xmlns:w10="urn:schemas-microsoft-com:office:word" xmlns:w="http://schemas.openxmlformats.org/wordprocessingml/2006/main" xmlns:w14="http://schemas.microsoft.com/office/word/2010/wordml" xmlns:w15="http://schemas.microsoft.com/office/word/2012/wordml" xmlns:w16cex="http://schemas.microsoft.com/office/word/2018/wordml/cex" xmlns:w16cid="http://schemas.microsoft.com/office/word/2016/wordml/cid" xmlns:w16="http://schemas.microsoft.com/office/word/2018/wordml" xmlns:w16sdtdh="http://schemas.microsoft.com/office/word/2020/wordml/sdtdatahash" xmlns:w16se="http://schemas.microsoft.com/office/word/2015/wordml/symex" xmlns:wpg="http://schemas.microsoft.com/office/word/2010/wordprocessingGroup" xmlns:wpi="http://schemas.microsoft.com/office/word/2010/wordprocessingInk" xmlns:wne="http://schemas.microsoft.com/office/word/2006/wordml" xmlns:wps="http://schemas.microsoft.com/office/word/2010/wordprocessingShape" mc:Ignorable="w14 w15 w16se w16cid w16 w16cex w16sdtdh wp14">
+<w15:commentsEx xmlns:wpc="http://schemas.microsoft.com/office/word/2010/wordprocessingCanvas" xmlns:cx="http://schemas.microsoft.com/office/drawing/2014/chartex" xmlns:cx1="http://schemas.microsoft.com/office/drawing/2015/9/8/chartex" xmlns:cx2="http://schemas.microsoft.com/office/drawing/2015/10/21/chartex" xmlns:cx3="http://schemas.microsoft.com/office/drawing/2016/5/9/chartex" xmlns:cx4="http://schemas.microsoft.com/office/drawing/2016/5/10/chartex" xmlns:cx5="http://schemas.microsoft.com/office/drawing/2016/5/11/chartex" xmlns:cx6="http://schemas.microsoft.com/office/drawing/2016/5/12/chartex" xmlns:cx7="http://schemas.microsoft.com/office/drawing/2016/5/13/chartex" xmlns:cx8="http://schemas.microsoft.com/office/drawing/2016/5/14/chartex" xmlns:mc="http://schemas.openxmlformats.org/markup-compatibility/2006" xmlns:aink="http://schemas.microsoft.com/office/drawing/2016/ink" xmlns:am3d="http://schemas.microsoft.com/office/drawing/2017/model3d" xmlns:o="urn:schemas-microsoft-com:office:office" xmlns:oel="http://schemas.microsoft.com/office/2019/extlst" xmlns:r="http://schemas.openxmlformats.org/officeDocument/2006/relationships" xmlns:m="http://schemas.openxmlformats.org/officeDocument/2006/math" xmlns:v="urn:schemas-microsoft-com:vml" xmlns:wp14="http://schemas.microsoft.com/office/word/2010/wordprocessingDrawing" xmlns:wp="http://schemas.openxmlformats.org/drawingml/2006/wordprocessingDrawing" xmlns:w10="urn:schemas-microsoft-com:office:word" xmlns:w="http://schemas.openxmlformats.org/wordprocessingml/2006/main" xmlns:w14="http://schemas.microsoft.com/office/word/2010/wordml" xmlns:w15="http://schemas.microsoft.com/office/word/2012/wordml" xmlns:w16cex="http://schemas.microsoft.com/office/word/2018/wordml/cex" xmlns:w16cid="http://schemas.microsoft.com/office/word/2016/wordml/cid" xmlns:w16="http://schemas.microsoft.com/office/word/2018/wordml" xmlns:w16du="http://schemas.microsoft.com/office/word/2023/wordml/word16du" xmlns:w16sdtdh="http://schemas.microsoft.com/office/word/2020/wordml/sdtdatahash" xmlns:w16sdtfl="http://schemas.microsoft.com/office/word/2024/wordml/sdtformatlock" xmlns:w16se="http://schemas.microsoft.com/office/word/2015/wordml/symex" xmlns:wpg="http://schemas.microsoft.com/office/word/2010/wordprocessingGroup" xmlns:wpi="http://schemas.microsoft.com/office/word/2010/wordprocessingInk" xmlns:wne="http://schemas.microsoft.com/office/word/2006/wordml" xmlns:wps="http://schemas.microsoft.com/office/word/2010/wordprocessingShape" mc:Ignorable="w14 w15 w16se w16cid w16 w16cex w16sdtdh w16sdtfl w16du wp14">
   <w15:commentEx w15:paraId="1C587E6E" w15:done="0"/>
 </w15:commentsEx>
 </file>
 
 <file path=word/commentsExtensible.xml><?xml version="1.0" encoding="utf-8"?>
-<w16cex:commentsExtensible xmlns:wpc="http://schemas.microsoft.com/office/word/2010/wordprocessingCanvas" xmlns:cx="http://schemas.microsoft.com/office/drawing/2014/chartex" xmlns:cx1="http://schemas.microsoft.com/office/drawing/2015/9/8/chartex" xmlns:cx2="http://schemas.microsoft.com/office/drawing/2015/10/21/chartex" xmlns:cx3="http://schemas.microsoft.com/office/drawing/2016/5/9/chartex" xmlns:cx4="http://schemas.microsoft.com/office/drawing/2016/5/10/chartex" xmlns:cx5="http://schemas.microsoft.com/office/drawing/2016/5/11/chartex" xmlns:cx6="http://schemas.microsoft.com/office/drawing/2016/5/12/chartex" xmlns:cx7="http://schemas.microsoft.com/office/drawing/2016/5/13/chartex" xmlns:cx8="http://schemas.microsoft.com/office/drawing/2016/5/14/chartex" xmlns:mc="http://schemas.openxmlformats.org/markup-compatibility/2006" xmlns:aink="http://schemas.microsoft.com/office/drawing/2016/ink" xmlns:am3d="http://schemas.microsoft.com/office/drawing/2017/model3d" xmlns:o="urn:schemas-microsoft-com:office:office" xmlns:oel="http://schemas.microsoft.com/office/2019/extlst" xmlns:r="http://schemas.openxmlformats.org/officeDocument/2006/relationships" xmlns:m="http://schemas.openxmlformats.org/officeDocument/2006/math" xmlns:v="urn:schemas-microsoft-com:vml" xmlns:wp14="http://schemas.microsoft.com/office/word/2010/wordprocessingDrawing" xmlns:wp="http://schemas.openxmlformats.org/drawingml/2006/wordprocessingDrawing" xmlns:w10="urn:schemas-microsoft-com:office:word" xmlns:w="http://schemas.openxmlformats.org/wordprocessingml/2006/main" xmlns:w14="http://schemas.microsoft.com/office/word/2010/wordml" xmlns:w15="http://schemas.microsoft.com/office/word/2012/wordml" xmlns:w16cex="http://schemas.microsoft.com/office/word/2018/wordml/cex" xmlns:w16cid="http://schemas.microsoft.com/office/word/2016/wordml/cid" xmlns:w16="http://schemas.microsoft.com/office/word/2018/wordml" xmlns:w16sdtdh="http://schemas.microsoft.com/office/word/2020/wordml/sdtdatahash" xmlns:w16se="http://schemas.microsoft.com/office/word/2015/wordml/symex" xmlns:wpg="http://schemas.microsoft.com/office/word/2010/wordprocessingGroup" xmlns:wpi="http://schemas.microsoft.com/office/word/2010/wordprocessingInk" xmlns:wne="http://schemas.microsoft.com/office/word/2006/wordml" xmlns:wps="http://schemas.microsoft.com/office/word/2010/wordprocessingShape" mc:Ignorable="w14 w15 w16se w16cid w16 w16cex w16sdtdh wp14">
+<w16cex:commentsExtensible xmlns:wpc="http://schemas.microsoft.com/office/word/2010/wordprocessingCanvas" xmlns:cx="http://schemas.microsoft.com/office/drawing/2014/chartex" xmlns:cx1="http://schemas.microsoft.com/office/drawing/2015/9/8/chartex" xmlns:cx2="http://schemas.microsoft.com/office/drawing/2015/10/21/chartex" xmlns:cx3="http://schemas.microsoft.com/office/drawing/2016/5/9/chartex" xmlns:cx4="http://schemas.microsoft.com/office/drawing/2016/5/10/chartex" xmlns:cx5="http://schemas.microsoft.com/office/drawing/2016/5/11/chartex" xmlns:cx6="http://schemas.microsoft.com/office/drawing/2016/5/12/chartex" xmlns:cx7="http://schemas.microsoft.com/office/drawing/2016/5/13/chartex" xmlns:cx8="http://schemas.microsoft.com/office/drawing/2016/5/14/chartex" xmlns:cr="http://schemas.microsoft.com/office/comments/2020/reactions" xmlns:mc="http://schemas.openxmlformats.org/markup-compatibility/2006" xmlns:aink="http://schemas.microsoft.com/office/drawing/2016/ink" xmlns:am3d="http://schemas.microsoft.com/office/drawing/2017/model3d" xmlns:o="urn:schemas-microsoft-com:office:office" xmlns:oel="http://schemas.microsoft.com/office/2019/extlst" xmlns:r="http://schemas.openxmlformats.org/officeDocument/2006/relationships" xmlns:m="http://schemas.openxmlformats.org/officeDocument/2006/math" xmlns:v="urn:schemas-microsoft-com:vml" xmlns:wp14="http://schemas.microsoft.com/office/word/2010/wordprocessingDrawing" xmlns:wp="http://schemas.openxmlformats.org/drawingml/2006/wordprocessingDrawing" xmlns:w10="urn:schemas-microsoft-com:office:word" xmlns:w="http://schemas.openxmlformats.org/wordprocessingml/2006/main" xmlns:w14="http://schemas.microsoft.com/office/word/2010/wordml" xmlns:w15="http://schemas.microsoft.com/office/word/2012/wordml" xmlns:w16cex="http://schemas.microsoft.com/office/word/2018/wordml/cex" xmlns:w16cid="http://schemas.microsoft.com/office/word/2016/wordml/cid" xmlns:w16="http://schemas.microsoft.com/office/word/2018/wordml" xmlns:w16du="http://schemas.microsoft.com/office/word/2023/wordml/word16du" xmlns:w16sdtdh="http://schemas.microsoft.com/office/word/2020/wordml/sdtdatahash" xmlns:w16sdtfl="http://schemas.microsoft.com/office/word/2024/wordml/sdtformatlock" xmlns:w16se="http://schemas.microsoft.com/office/word/2015/wordml/symex" xmlns:wpg="http://schemas.microsoft.com/office/word/2010/wordprocessingGroup" xmlns:wpi="http://schemas.microsoft.com/office/word/2010/wordprocessingInk" xmlns:wne="http://schemas.microsoft.com/office/word/2006/wordml" xmlns:wps="http://schemas.microsoft.com/office/word/2010/wordprocessingShape" mc:Ignorable="w14 w15 w16se w16cid w16 w16cex w16sdtdh w16sdtfl cr w16du wp14">
   <w16cex:commentExtensible w16cex:durableId="6B06427A" w16cex:dateUtc="2023-10-23T19:36:00Z"/>
 </w16cex:commentsExtensible>
 </file>
 
 <file path=word/commentsIds.xml><?xml version="1.0" encoding="utf-8"?>
-<w16cid:commentsIds xmlns:wpc="http://schemas.microsoft.com/office/word/2010/wordprocessingCanvas" xmlns:cx="http://schemas.microsoft.com/office/drawing/2014/chartex" xmlns:cx1="http://schemas.microsoft.com/office/drawing/2015/9/8/chartex" xmlns:cx2="http://schemas.microsoft.com/office/drawing/2015/10/21/chartex" xmlns:cx3="http://schemas.microsoft.com/office/drawing/2016/5/9/chartex" xmlns:cx4="http://schemas.microsoft.com/office/drawing/2016/5/10/chartex" xmlns:cx5="http://schemas.microsoft.com/office/drawing/2016/5/11/chartex" xmlns:cx6="http://schemas.microsoft.com/office/drawing/2016/5/12/chartex" xmlns:cx7="http://schemas.microsoft.com/office/drawing/2016/5/13/chartex" xmlns:cx8="http://schemas.microsoft.com/office/drawing/2016/5/14/chartex" xmlns:mc="http://schemas.openxmlformats.org/markup-compatibility/2006" xmlns:aink="http://schemas.microsoft.com/office/drawing/2016/ink" xmlns:am3d="http://schemas.microsoft.com/office/drawing/2017/model3d" xmlns:o="urn:schemas-microsoft-com:office:office" xmlns:oel="http://schemas.microsoft.com/office/2019/extlst" xmlns:r="http://schemas.openxmlformats.org/officeDocument/2006/relationships" xmlns:m="http://schemas.openxmlformats.org/officeDocument/2006/math" xmlns:v="urn:schemas-microsoft-com:vml" xmlns:wp14="http://schemas.microsoft.com/office/word/2010/wordprocessingDrawing" xmlns:wp="http://schemas.openxmlformats.org/drawingml/2006/wordprocessingDrawing" xmlns:w10="urn:schemas-microsoft-com:office:word" xmlns:w="http://schemas.openxmlformats.org/wordprocessingml/2006/main" xmlns:w14="http://schemas.microsoft.com/office/word/2010/wordml" xmlns:w15="http://schemas.microsoft.com/office/word/2012/wordml" xmlns:w16cex="http://schemas.microsoft.com/office/word/2018/wordml/cex" xmlns:w16cid="http://schemas.microsoft.com/office/word/2016/wordml/cid" xmlns:w16="http://schemas.microsoft.com/office/word/2018/wordml" xmlns:w16sdtdh="http://schemas.microsoft.com/office/word/2020/wordml/sdtdatahash" xmlns:w16se="http://schemas.microsoft.com/office/word/2015/wordml/symex" xmlns:wpg="http://schemas.microsoft.com/office/word/2010/wordprocessingGroup" xmlns:wpi="http://schemas.microsoft.com/office/word/2010/wordprocessingInk" xmlns:wne="http://schemas.microsoft.com/office/word/2006/wordml" xmlns:wps="http://schemas.microsoft.com/office/word/2010/wordprocessingShape" mc:Ignorable="w14 w15 w16se w16cid w16 w16cex w16sdtdh wp14">
+<w16cid:commentsIds xmlns:wpc="http://schemas.microsoft.com/office/word/2010/wordprocessingCanvas" xmlns:cx="http://schemas.microsoft.com/office/drawing/2014/chartex" xmlns:cx1="http://schemas.microsoft.com/office/drawing/2015/9/8/chartex" xmlns:cx2="http://schemas.microsoft.com/office/drawing/2015/10/21/chartex" xmlns:cx3="http://schemas.microsoft.com/office/drawing/2016/5/9/chartex" xmlns:cx4="http://schemas.microsoft.com/office/drawing/2016/5/10/chartex" xmlns:cx5="http://schemas.microsoft.com/office/drawing/2016/5/11/chartex" xmlns:cx6="http://schemas.microsoft.com/office/drawing/2016/5/12/chartex" xmlns:cx7="http://schemas.microsoft.com/office/drawing/2016/5/13/chartex" xmlns:cx8="http://schemas.microsoft.com/office/drawing/2016/5/14/chartex" xmlns:mc="http://schemas.openxmlformats.org/markup-compatibility/2006" xmlns:aink="http://schemas.microsoft.com/office/drawing/2016/ink" xmlns:am3d="http://schemas.microsoft.com/office/drawing/2017/model3d" xmlns:o="urn:schemas-microsoft-com:office:office" xmlns:oel="http://schemas.microsoft.com/office/2019/extlst" xmlns:r="http://schemas.openxmlformats.org/officeDocument/2006/relationships" xmlns:m="http://schemas.openxmlformats.org/officeDocument/2006/math" xmlns:v="urn:schemas-microsoft-com:vml" xmlns:wp14="http://schemas.microsoft.com/office/word/2010/wordprocessingDrawing" xmlns:wp="http://schemas.openxmlformats.org/drawingml/2006/wordprocessingDrawing" xmlns:w10="urn:schemas-microsoft-com:office:word" xmlns:w="http://schemas.openxmlformats.org/wordprocessingml/2006/main" xmlns:w14="http://schemas.microsoft.com/office/word/2010/wordml" xmlns:w15="http://schemas.microsoft.com/office/word/2012/wordml" xmlns:w16cex="http://schemas.microsoft.com/office/word/2018/wordml/cex" xmlns:w16cid="http://schemas.microsoft.com/office/word/2016/wordml/cid" xmlns:w16="http://schemas.microsoft.com/office/word/2018/wordml" xmlns:w16du="http://schemas.microsoft.com/office/word/2023/wordml/word16du" xmlns:w16sdtdh="http://schemas.microsoft.com/office/word/2020/wordml/sdtdatahash" xmlns:w16sdtfl="http://schemas.microsoft.com/office/word/2024/wordml/sdtformatlock" xmlns:w16se="http://schemas.microsoft.com/office/word/2015/wordml/symex" xmlns:wpg="http://schemas.microsoft.com/office/word/2010/wordprocessingGroup" xmlns:wpi="http://schemas.microsoft.com/office/word/2010/wordprocessingInk" xmlns:wne="http://schemas.microsoft.com/office/word/2006/wordml" xmlns:wps="http://schemas.microsoft.com/office/word/2010/wordprocessingShape" mc:Ignorable="w14 w15 w16se w16cid w16 w16cex w16sdtdh w16sdtfl w16du wp14">
   <w16cid:commentId w16cid:paraId="1C587E6E" w16cid:durableId="6B06427A"/>
 </w16cid:commentsIds>
 </file>
 
 <file path=word/endnotes.xml><?xml version="1.0" encoding="utf-8"?>
-<w:endnotes xmlns:wpc="http://schemas.microsoft.com/office/word/2010/wordprocessingCanvas" xmlns:cx="http://schemas.microsoft.com/office/drawing/2014/chartex" xmlns:cx1="http://schemas.microsoft.com/office/drawing/2015/9/8/chartex" xmlns:cx2="http://schemas.microsoft.com/office/drawing/2015/10/21/chartex" xmlns:cx3="http://schemas.microsoft.com/office/drawing/2016/5/9/chartex" xmlns:cx4="http://schemas.microsoft.com/office/drawing/2016/5/10/chartex" xmlns:cx5="http://schemas.microsoft.com/office/drawing/2016/5/11/chartex" xmlns:cx6="http://schemas.microsoft.com/office/drawing/2016/5/12/chartex" xmlns:cx7="http://schemas.microsoft.com/office/drawing/2016/5/13/chartex" xmlns:cx8="http://schemas.microsoft.com/office/drawing/2016/5/14/chartex" xmlns:mc="http://schemas.openxmlformats.org/markup-compatibility/2006" xmlns:aink="http://schemas.microsoft.com/office/drawing/2016/ink" xmlns:am3d="http://schemas.microsoft.com/office/drawing/2017/model3d" xmlns:o="urn:schemas-microsoft-com:office:office" xmlns:oel="http://schemas.microsoft.com/office/2019/extlst" xmlns:r="http://schemas.openxmlformats.org/officeDocument/2006/relationships" xmlns:m="http://schemas.openxmlformats.org/officeDocument/2006/math" xmlns:v="urn:schemas-microsoft-com:vml" xmlns:wp14="http://schemas.microsoft.com/office/word/2010/wordprocessingDrawing" xmlns:wp="http://schemas.openxmlformats.org/drawingml/2006/wordprocessingDrawing" xmlns:w10="urn:schemas-microsoft-com:office:word" xmlns:w="http://schemas.openxmlformats.org/wordprocessingml/2006/main" xmlns:w14="http://schemas.microsoft.com/office/word/2010/wordml" xmlns:w15="http://schemas.microsoft.com/office/word/2012/wordml" xmlns:w16cex="http://schemas.microsoft.com/office/word/2018/wordml/cex" xmlns:w16cid="http://schemas.microsoft.com/office/word/2016/wordml/cid" xmlns:w16="http://schemas.microsoft.com/office/word/2018/wordml" xmlns:w16sdtdh="http://schemas.microsoft.com/office/word/2020/wordml/sdtdatahash" xmlns:w16se="http://schemas.microsoft.com/office/word/2015/wordml/symex" xmlns:wpg="http://schemas.microsoft.com/office/word/2010/wordprocessingGroup" xmlns:wpi="http://schemas.microsoft.com/office/word/2010/wordprocessingInk" xmlns:wne="http://schemas.microsoft.com/office/word/2006/wordml" xmlns:wps="http://schemas.microsoft.com/office/word/2010/wordprocessingShape" mc:Ignorable="w14 w15 w16se w16cid w16 w16cex w16sdtdh wp14">
+<w:endnotes xmlns:wpc="http://schemas.microsoft.com/office/word/2010/wordprocessingCanvas" xmlns:cx="http://schemas.microsoft.com/office/drawing/2014/chartex" xmlns:cx1="http://schemas.microsoft.com/office/drawing/2015/9/8/chartex" xmlns:cx2="http://schemas.microsoft.com/office/drawing/2015/10/21/chartex" xmlns:cx3="http://schemas.microsoft.com/office/drawing/2016/5/9/chartex" xmlns:cx4="http://schemas.microsoft.com/office/drawing/2016/5/10/chartex" xmlns:cx5="http://schemas.microsoft.com/office/drawing/2016/5/11/chartex" xmlns:cx6="http://schemas.microsoft.com/office/drawing/2016/5/12/chartex" xmlns:cx7="http://schemas.microsoft.com/office/drawing/2016/5/13/chartex" xmlns:cx8="http://schemas.microsoft.com/office/drawing/2016/5/14/chartex" xmlns:mc="http://schemas.openxmlformats.org/markup-compatibility/2006" xmlns:aink="http://schemas.microsoft.com/office/drawing/2016/ink" xmlns:am3d="http://schemas.microsoft.com/office/drawing/2017/model3d" xmlns:o="urn:schemas-microsoft-com:office:office" xmlns:oel="http://schemas.microsoft.com/office/2019/extlst" xmlns:r="http://schemas.openxmlformats.org/officeDocument/2006/relationships" xmlns:m="http://schemas.openxmlformats.org/officeDocument/2006/math" xmlns:v="urn:schemas-microsoft-com:vml" xmlns:wp14="http://schemas.microsoft.com/office/word/2010/wordprocessingDrawing" xmlns:wp="http://schemas.openxmlformats.org/drawingml/2006/wordprocessingDrawing" xmlns:w10="urn:schemas-microsoft-com:office:word" xmlns:w="http://schemas.openxmlformats.org/wordprocessingml/2006/main" xmlns:w14="http://schemas.microsoft.com/office/word/2010/wordml" xmlns:w15="http://schemas.microsoft.com/office/word/2012/wordml" xmlns:w16cex="http://schemas.microsoft.com/office/word/2018/wordml/cex" xmlns:w16cid="http://schemas.microsoft.com/office/word/2016/wordml/cid" xmlns:w16="http://schemas.microsoft.com/office/word/2018/wordml" xmlns:w16du="http://schemas.microsoft.com/office/word/2023/wordml/word16du" xmlns:w16sdtdh="http://schemas.microsoft.com/office/word/2020/wordml/sdtdatahash" xmlns:w16sdtfl="http://schemas.microsoft.com/office/word/2024/wordml/sdtformatlock" xmlns:w16se="http://schemas.microsoft.com/office/word/2015/wordml/symex" xmlns:wpg="http://schemas.microsoft.com/office/word/2010/wordprocessingGroup" xmlns:wpi="http://schemas.microsoft.com/office/word/2010/wordprocessingInk" xmlns:wne="http://schemas.microsoft.com/office/word/2006/wordml" xmlns:wps="http://schemas.microsoft.com/office/word/2010/wordprocessingShape" mc:Ignorable="w14 w15 w16se w16cid w16 w16cex w16sdtdh w16sdtfl w16du wp14">
   <w:endnote w:type="separator" w:id="-1">
     <w:p>
       <w:pPr>
@@ -3258,7 +3258,7 @@
 </file>
 
 <file path=word/footer1.xml><?xml version="1.0" encoding="utf-8"?>
-<w:ftr xmlns:wpc="http://schemas.microsoft.com/office/word/2010/wordprocessingCanvas" xmlns:cx="http://schemas.microsoft.com/office/drawing/2014/chartex" xmlns:cx1="http://schemas.microsoft.com/office/drawing/2015/9/8/chartex" xmlns:cx2="http://schemas.microsoft.com/office/drawing/2015/10/21/chartex" xmlns:cx3="http://schemas.microsoft.com/office/drawing/2016/5/9/chartex" xmlns:cx4="http://schemas.microsoft.com/office/drawing/2016/5/10/chartex" xmlns:cx5="http://schemas.microsoft.com/office/drawing/2016/5/11/chartex" xmlns:cx6="http://schemas.microsoft.com/office/drawing/2016/5/12/chartex" xmlns:cx7="http://schemas.microsoft.com/office/drawing/2016/5/13/chartex" xmlns:cx8="http://schemas.microsoft.com/office/drawing/2016/5/14/chartex" xmlns:mc="http://schemas.openxmlformats.org/markup-compatibility/2006" xmlns:aink="http://schemas.microsoft.com/office/drawing/2016/ink" xmlns:am3d="http://schemas.microsoft.com/office/drawing/2017/model3d" xmlns:o="urn:schemas-microsoft-com:office:office" xmlns:oel="http://schemas.microsoft.com/office/2019/extlst" xmlns:r="http://schemas.openxmlformats.org/officeDocument/2006/relationships" xmlns:m="http://schemas.openxmlformats.org/officeDocument/2006/math" xmlns:v="urn:schemas-microsoft-com:vml" xmlns:wp14="http://schemas.microsoft.com/office/word/2010/wordprocessingDrawing" xmlns:wp="http://schemas.openxmlformats.org/drawingml/2006/wordprocessingDrawing" xmlns:w10="urn:schemas-microsoft-com:office:word" xmlns:w="http://schemas.openxmlformats.org/wordprocessingml/2006/main" xmlns:w14="http://schemas.microsoft.com/office/word/2010/wordml" xmlns:w15="http://schemas.microsoft.com/office/word/2012/wordml" xmlns:w16cex="http://schemas.microsoft.com/office/word/2018/wordml/cex" xmlns:w16cid="http://schemas.microsoft.com/office/word/2016/wordml/cid" xmlns:w16="http://schemas.microsoft.com/office/word/2018/wordml" xmlns:w16sdtdh="http://schemas.microsoft.com/office/word/2020/wordml/sdtdatahash" xmlns:w16se="http://schemas.microsoft.com/office/word/2015/wordml/symex" xmlns:wpg="http://schemas.microsoft.com/office/word/2010/wordprocessingGroup" xmlns:wpi="http://schemas.microsoft.com/office/word/2010/wordprocessingInk" xmlns:wne="http://schemas.microsoft.com/office/word/2006/wordml" xmlns:wps="http://schemas.microsoft.com/office/word/2010/wordprocessingShape" mc:Ignorable="w14 w15 w16se w16cid w16 w16cex w16sdtdh wp14">
+<w:ftr xmlns:wpc="http://schemas.microsoft.com/office/word/2010/wordprocessingCanvas" xmlns:cx="http://schemas.microsoft.com/office/drawing/2014/chartex" xmlns:cx1="http://schemas.microsoft.com/office/drawing/2015/9/8/chartex" xmlns:cx2="http://schemas.microsoft.com/office/drawing/2015/10/21/chartex" xmlns:cx3="http://schemas.microsoft.com/office/drawing/2016/5/9/chartex" xmlns:cx4="http://schemas.microsoft.com/office/drawing/2016/5/10/chartex" xmlns:cx5="http://schemas.microsoft.com/office/drawing/2016/5/11/chartex" xmlns:cx6="http://schemas.microsoft.com/office/drawing/2016/5/12/chartex" xmlns:cx7="http://schemas.microsoft.com/office/drawing/2016/5/13/chartex" xmlns:cx8="http://schemas.microsoft.com/office/drawing/2016/5/14/chartex" xmlns:mc="http://schemas.openxmlformats.org/markup-compatibility/2006" xmlns:aink="http://schemas.microsoft.com/office/drawing/2016/ink" xmlns:am3d="http://schemas.microsoft.com/office/drawing/2017/model3d" xmlns:o="urn:schemas-microsoft-com:office:office" xmlns:oel="http://schemas.microsoft.com/office/2019/extlst" xmlns:r="http://schemas.openxmlformats.org/officeDocument/2006/relationships" xmlns:m="http://schemas.openxmlformats.org/officeDocument/2006/math" xmlns:v="urn:schemas-microsoft-com:vml" xmlns:wp14="http://schemas.microsoft.com/office/word/2010/wordprocessingDrawing" xmlns:wp="http://schemas.openxmlformats.org/drawingml/2006/wordprocessingDrawing" xmlns:w10="urn:schemas-microsoft-com:office:word" xmlns:w="http://schemas.openxmlformats.org/wordprocessingml/2006/main" xmlns:w14="http://schemas.microsoft.com/office/word/2010/wordml" xmlns:w15="http://schemas.microsoft.com/office/word/2012/wordml" xmlns:w16cex="http://schemas.microsoft.com/office/word/2018/wordml/cex" xmlns:w16cid="http://schemas.microsoft.com/office/word/2016/wordml/cid" xmlns:w16="http://schemas.microsoft.com/office/word/2018/wordml" xmlns:w16du="http://schemas.microsoft.com/office/word/2023/wordml/word16du" xmlns:w16sdtdh="http://schemas.microsoft.com/office/word/2020/wordml/sdtdatahash" xmlns:w16sdtfl="http://schemas.microsoft.com/office/word/2024/wordml/sdtformatlock" xmlns:w16se="http://schemas.microsoft.com/office/word/2015/wordml/symex" xmlns:wpg="http://schemas.microsoft.com/office/word/2010/wordprocessingGroup" xmlns:wpi="http://schemas.microsoft.com/office/word/2010/wordprocessingInk" xmlns:wne="http://schemas.microsoft.com/office/word/2006/wordml" xmlns:wps="http://schemas.microsoft.com/office/word/2010/wordprocessingShape" mc:Ignorable="w14 w15 w16se w16cid w16 w16cex w16sdtdh w16sdtfl w16du wp14">
   <w:p>
     <w:pPr>
       <w:pStyle w:val="Footer"/>
@@ -3268,7 +3268,7 @@
 </file>
 
 <file path=word/footer2.xml><?xml version="1.0" encoding="utf-8"?>
-<w:ftr xmlns:wpc="http://schemas.microsoft.com/office/word/2010/wordprocessingCanvas" xmlns:cx="http://schemas.microsoft.com/office/drawing/2014/chartex" xmlns:cx1="http://schemas.microsoft.com/office/drawing/2015/9/8/chartex" xmlns:cx2="http://schemas.microsoft.com/office/drawing/2015/10/21/chartex" xmlns:cx3="http://schemas.microsoft.com/office/drawing/2016/5/9/chartex" xmlns:cx4="http://schemas.microsoft.com/office/drawing/2016/5/10/chartex" xmlns:cx5="http://schemas.microsoft.com/office/drawing/2016/5/11/chartex" xmlns:cx6="http://schemas.microsoft.com/office/drawing/2016/5/12/chartex" xmlns:cx7="http://schemas.microsoft.com/office/drawing/2016/5/13/chartex" xmlns:cx8="http://schemas.microsoft.com/office/drawing/2016/5/14/chartex" xmlns:mc="http://schemas.openxmlformats.org/markup-compatibility/2006" xmlns:aink="http://schemas.microsoft.com/office/drawing/2016/ink" xmlns:am3d="http://schemas.microsoft.com/office/drawing/2017/model3d" xmlns:o="urn:schemas-microsoft-com:office:office" xmlns:oel="http://schemas.microsoft.com/office/2019/extlst" xmlns:r="http://schemas.openxmlformats.org/officeDocument/2006/relationships" xmlns:m="http://schemas.openxmlformats.org/officeDocument/2006/math" xmlns:v="urn:schemas-microsoft-com:vml" xmlns:wp14="http://schemas.microsoft.com/office/word/2010/wordprocessingDrawing" xmlns:wp="http://schemas.openxmlformats.org/drawingml/2006/wordprocessingDrawing" xmlns:w10="urn:schemas-microsoft-com:office:word" xmlns:w="http://schemas.openxmlformats.org/wordprocessingml/2006/main" xmlns:w14="http://schemas.microsoft.com/office/word/2010/wordml" xmlns:w15="http://schemas.microsoft.com/office/word/2012/wordml" xmlns:w16cex="http://schemas.microsoft.com/office/word/2018/wordml/cex" xmlns:w16cid="http://schemas.microsoft.com/office/word/2016/wordml/cid" xmlns:w16="http://schemas.microsoft.com/office/word/2018/wordml" xmlns:w16sdtdh="http://schemas.microsoft.com/office/word/2020/wordml/sdtdatahash" xmlns:w16se="http://schemas.microsoft.com/office/word/2015/wordml/symex" xmlns:wpg="http://schemas.microsoft.com/office/word/2010/wordprocessingGroup" xmlns:wpi="http://schemas.microsoft.com/office/word/2010/wordprocessingInk" xmlns:wne="http://schemas.microsoft.com/office/word/2006/wordml" xmlns:wps="http://schemas.microsoft.com/office/word/2010/wordprocessingShape" mc:Ignorable="w14 w15 w16se w16cid w16 w16cex w16sdtdh wp14">
+<w:ftr xmlns:wpc="http://schemas.microsoft.com/office/word/2010/wordprocessingCanvas" xmlns:cx="http://schemas.microsoft.com/office/drawing/2014/chartex" xmlns:cx1="http://schemas.microsoft.com/office/drawing/2015/9/8/chartex" xmlns:cx2="http://schemas.microsoft.com/office/drawing/2015/10/21/chartex" xmlns:cx3="http://schemas.microsoft.com/office/drawing/2016/5/9/chartex" xmlns:cx4="http://schemas.microsoft.com/office/drawing/2016/5/10/chartex" xmlns:cx5="http://schemas.microsoft.com/office/drawing/2016/5/11/chartex" xmlns:cx6="http://schemas.microsoft.com/office/drawing/2016/5/12/chartex" xmlns:cx7="http://schemas.microsoft.com/office/drawing/2016/5/13/chartex" xmlns:cx8="http://schemas.microsoft.com/office/drawing/2016/5/14/chartex" xmlns:mc="http://schemas.openxmlformats.org/markup-compatibility/2006" xmlns:aink="http://schemas.microsoft.com/office/drawing/2016/ink" xmlns:am3d="http://schemas.microsoft.com/office/drawing/2017/model3d" xmlns:o="urn:schemas-microsoft-com:office:office" xmlns:oel="http://schemas.microsoft.com/office/2019/extlst" xmlns:r="http://schemas.openxmlformats.org/officeDocument/2006/relationships" xmlns:m="http://schemas.openxmlformats.org/officeDocument/2006/math" xmlns:v="urn:schemas-microsoft-com:vml" xmlns:wp14="http://schemas.microsoft.com/office/word/2010/wordprocessingDrawing" xmlns:wp="http://schemas.openxmlformats.org/drawingml/2006/wordprocessingDrawing" xmlns:w10="urn:schemas-microsoft-com:office:word" xmlns:w="http://schemas.openxmlformats.org/wordprocessingml/2006/main" xmlns:w14="http://schemas.microsoft.com/office/word/2010/wordml" xmlns:w15="http://schemas.microsoft.com/office/word/2012/wordml" xmlns:w16cex="http://schemas.microsoft.com/office/word/2018/wordml/cex" xmlns:w16cid="http://schemas.microsoft.com/office/word/2016/wordml/cid" xmlns:w16="http://schemas.microsoft.com/office/word/2018/wordml" xmlns:w16du="http://schemas.microsoft.com/office/word/2023/wordml/word16du" xmlns:w16sdtdh="http://schemas.microsoft.com/office/word/2020/wordml/sdtdatahash" xmlns:w16sdtfl="http://schemas.microsoft.com/office/word/2024/wordml/sdtformatlock" xmlns:w16se="http://schemas.microsoft.com/office/word/2015/wordml/symex" xmlns:wpg="http://schemas.microsoft.com/office/word/2010/wordprocessingGroup" xmlns:wpi="http://schemas.microsoft.com/office/word/2010/wordprocessingInk" xmlns:wne="http://schemas.microsoft.com/office/word/2006/wordml" xmlns:wps="http://schemas.microsoft.com/office/word/2010/wordprocessingShape" mc:Ignorable="w14 w15 w16se w16cid w16 w16cex w16sdtdh w16sdtfl w16du wp14">
   <w:p>
     <w:pPr>
       <w:pStyle w:val="Footer"/>
@@ -3286,7 +3286,7 @@
 </file>
 
 <file path=word/footer3.xml><?xml version="1.0" encoding="utf-8"?>
-<w:ftr xmlns:wpc="http://schemas.microsoft.com/office/word/2010/wordprocessingCanvas" xmlns:cx="http://schemas.microsoft.com/office/drawing/2014/chartex" xmlns:cx1="http://schemas.microsoft.com/office/drawing/2015/9/8/chartex" xmlns:cx2="http://schemas.microsoft.com/office/drawing/2015/10/21/chartex" xmlns:cx3="http://schemas.microsoft.com/office/drawing/2016/5/9/chartex" xmlns:cx4="http://schemas.microsoft.com/office/drawing/2016/5/10/chartex" xmlns:cx5="http://schemas.microsoft.com/office/drawing/2016/5/11/chartex" xmlns:cx6="http://schemas.microsoft.com/office/drawing/2016/5/12/chartex" xmlns:cx7="http://schemas.microsoft.com/office/drawing/2016/5/13/chartex" xmlns:cx8="http://schemas.microsoft.com/office/drawing/2016/5/14/chartex" xmlns:mc="http://schemas.openxmlformats.org/markup-compatibility/2006" xmlns:aink="http://schemas.microsoft.com/office/drawing/2016/ink" xmlns:am3d="http://schemas.microsoft.com/office/drawing/2017/model3d" xmlns:o="urn:schemas-microsoft-com:office:office" xmlns:oel="http://schemas.microsoft.com/office/2019/extlst" xmlns:r="http://schemas.openxmlformats.org/officeDocument/2006/relationships" xmlns:m="http://schemas.openxmlformats.org/officeDocument/2006/math" xmlns:v="urn:schemas-microsoft-com:vml" xmlns:wp14="http://schemas.microsoft.com/office/word/2010/wordprocessingDrawing" xmlns:wp="http://schemas.openxmlformats.org/drawingml/2006/wordprocessingDrawing" xmlns:w10="urn:schemas-microsoft-com:office:word" xmlns:w="http://schemas.openxmlformats.org/wordprocessingml/2006/main" xmlns:w14="http://schemas.microsoft.com/office/word/2010/wordml" xmlns:w15="http://schemas.microsoft.com/office/word/2012/wordml" xmlns:w16cex="http://schemas.microsoft.com/office/word/2018/wordml/cex" xmlns:w16cid="http://schemas.microsoft.com/office/word/2016/wordml/cid" xmlns:w16="http://schemas.microsoft.com/office/word/2018/wordml" xmlns:w16sdtdh="http://schemas.microsoft.com/office/word/2020/wordml/sdtdatahash" xmlns:w16se="http://schemas.microsoft.com/office/word/2015/wordml/symex" xmlns:wpg="http://schemas.microsoft.com/office/word/2010/wordprocessingGroup" xmlns:wpi="http://schemas.microsoft.com/office/word/2010/wordprocessingInk" xmlns:wne="http://schemas.microsoft.com/office/word/2006/wordml" xmlns:wps="http://schemas.microsoft.com/office/word/2010/wordprocessingShape" mc:Ignorable="w14 w15 w16se w16cid w16 w16cex w16sdtdh wp14">
+<w:ftr xmlns:wpc="http://schemas.microsoft.com/office/word/2010/wordprocessingCanvas" xmlns:cx="http://schemas.microsoft.com/office/drawing/2014/chartex" xmlns:cx1="http://schemas.microsoft.com/office/drawing/2015/9/8/chartex" xmlns:cx2="http://schemas.microsoft.com/office/drawing/2015/10/21/chartex" xmlns:cx3="http://schemas.microsoft.com/office/drawing/2016/5/9/chartex" xmlns:cx4="http://schemas.microsoft.com/office/drawing/2016/5/10/chartex" xmlns:cx5="http://schemas.microsoft.com/office/drawing/2016/5/11/chartex" xmlns:cx6="http://schemas.microsoft.com/office/drawing/2016/5/12/chartex" xmlns:cx7="http://schemas.microsoft.com/office/drawing/2016/5/13/chartex" xmlns:cx8="http://schemas.microsoft.com/office/drawing/2016/5/14/chartex" xmlns:mc="http://schemas.openxmlformats.org/markup-compatibility/2006" xmlns:aink="http://schemas.microsoft.com/office/drawing/2016/ink" xmlns:am3d="http://schemas.microsoft.com/office/drawing/2017/model3d" xmlns:o="urn:schemas-microsoft-com:office:office" xmlns:oel="http://schemas.microsoft.com/office/2019/extlst" xmlns:r="http://schemas.openxmlformats.org/officeDocument/2006/relationships" xmlns:m="http://schemas.openxmlformats.org/officeDocument/2006/math" xmlns:v="urn:schemas-microsoft-com:vml" xmlns:wp14="http://schemas.microsoft.com/office/word/2010/wordprocessingDrawing" xmlns:wp="http://schemas.openxmlformats.org/drawingml/2006/wordprocessingDrawing" xmlns:w10="urn:schemas-microsoft-com:office:word" xmlns:w="http://schemas.openxmlformats.org/wordprocessingml/2006/main" xmlns:w14="http://schemas.microsoft.com/office/word/2010/wordml" xmlns:w15="http://schemas.microsoft.com/office/word/2012/wordml" xmlns:w16cex="http://schemas.microsoft.com/office/word/2018/wordml/cex" xmlns:w16cid="http://schemas.microsoft.com/office/word/2016/wordml/cid" xmlns:w16="http://schemas.microsoft.com/office/word/2018/wordml" xmlns:w16du="http://schemas.microsoft.com/office/word/2023/wordml/word16du" xmlns:w16sdtdh="http://schemas.microsoft.com/office/word/2020/wordml/sdtdatahash" xmlns:w16sdtfl="http://schemas.microsoft.com/office/word/2024/wordml/sdtformatlock" xmlns:w16se="http://schemas.microsoft.com/office/word/2015/wordml/symex" xmlns:wpg="http://schemas.microsoft.com/office/word/2010/wordprocessingGroup" xmlns:wpi="http://schemas.microsoft.com/office/word/2010/wordprocessingInk" xmlns:wne="http://schemas.microsoft.com/office/word/2006/wordml" xmlns:wps="http://schemas.microsoft.com/office/word/2010/wordprocessingShape" mc:Ignorable="w14 w15 w16se w16cid w16 w16cex w16sdtdh w16sdtfl w16du wp14">
   <w:p>
     <w:pPr>
       <w:pStyle w:val="Footer"/>
@@ -3296,7 +3296,7 @@
 </file>
 
 <file path=word/footnotes.xml><?xml version="1.0" encoding="utf-8"?>
-<w:footnotes xmlns:wpc="http://schemas.microsoft.com/office/word/2010/wordprocessingCanvas" xmlns:cx="http://schemas.microsoft.com/office/drawing/2014/chartex" xmlns:cx1="http://schemas.microsoft.com/office/drawing/2015/9/8/chartex" xmlns:cx2="http://schemas.microsoft.com/office/drawing/2015/10/21/chartex" xmlns:cx3="http://schemas.microsoft.com/office/drawing/2016/5/9/chartex" xmlns:cx4="http://schemas.microsoft.com/office/drawing/2016/5/10/chartex" xmlns:cx5="http://schemas.microsoft.com/office/drawing/2016/5/11/chartex" xmlns:cx6="http://schemas.microsoft.com/office/drawing/2016/5/12/chartex" xmlns:cx7="http://schemas.microsoft.com/office/drawing/2016/5/13/chartex" xmlns:cx8="http://schemas.microsoft.com/office/drawing/2016/5/14/chartex" xmlns:mc="http://schemas.openxmlformats.org/markup-compatibility/2006" xmlns:aink="http://schemas.microsoft.com/office/drawing/2016/ink" xmlns:am3d="http://schemas.microsoft.com/office/drawing/2017/model3d" xmlns:o="urn:schemas-microsoft-com:office:office" xmlns:oel="http://schemas.microsoft.com/office/2019/extlst" xmlns:r="http://schemas.openxmlformats.org/officeDocument/2006/relationships" xmlns:m="http://schemas.openxmlformats.org/officeDocument/2006/math" xmlns:v="urn:schemas-microsoft-com:vml" xmlns:wp14="http://schemas.microsoft.com/office/word/2010/wordprocessingDrawing" xmlns:wp="http://schemas.openxmlformats.org/drawingml/2006/wordprocessingDrawing" xmlns:w10="urn:schemas-microsoft-com:office:word" xmlns:w="http://schemas.openxmlformats.org/wordprocessingml/2006/main" xmlns:w14="http://schemas.microsoft.com/office/word/2010/wordml" xmlns:w15="http://schemas.microsoft.com/office/word/2012/wordml" xmlns:w16cex="http://schemas.microsoft.com/office/word/2018/wordml/cex" xmlns:w16cid="http://schemas.microsoft.com/office/word/2016/wordml/cid" xmlns:w16="http://schemas.microsoft.com/office/word/2018/wordml" xmlns:w16sdtdh="http://schemas.microsoft.com/office/word/2020/wordml/sdtdatahash" xmlns:w16se="http://schemas.microsoft.com/office/word/2015/wordml/symex" xmlns:wpg="http://schemas.microsoft.com/office/word/2010/wordprocessingGroup" xmlns:wpi="http://schemas.microsoft.com/office/word/2010/wordprocessingInk" xmlns:wne="http://schemas.microsoft.com/office/word/2006/wordml" xmlns:wps="http://schemas.microsoft.com/office/word/2010/wordprocessingShape" mc:Ignorable="w14 w15 w16se w16cid w16 w16cex w16sdtdh wp14">
+<w:footnotes xmlns:wpc="http://schemas.microsoft.com/office/word/2010/wordprocessingCanvas" xmlns:cx="http://schemas.microsoft.com/office/drawing/2014/chartex" xmlns:cx1="http://schemas.microsoft.com/office/drawing/2015/9/8/chartex" xmlns:cx2="http://schemas.microsoft.com/office/drawing/2015/10/21/chartex" xmlns:cx3="http://schemas.microsoft.com/office/drawing/2016/5/9/chartex" xmlns:cx4="http://schemas.microsoft.com/office/drawing/2016/5/10/chartex" xmlns:cx5="http://schemas.microsoft.com/office/drawing/2016/5/11/chartex" xmlns:cx6="http://schemas.microsoft.com/office/drawing/2016/5/12/chartex" xmlns:cx7="http://schemas.microsoft.com/office/drawing/2016/5/13/chartex" xmlns:cx8="http://schemas.microsoft.com/office/drawing/2016/5/14/chartex" xmlns:mc="http://schemas.openxmlformats.org/markup-compatibility/2006" xmlns:aink="http://schemas.microsoft.com/office/drawing/2016/ink" xmlns:am3d="http://schemas.microsoft.com/office/drawing/2017/model3d" xmlns:o="urn:schemas-microsoft-com:office:office" xmlns:oel="http://schemas.microsoft.com/office/2019/extlst" xmlns:r="http://schemas.openxmlformats.org/officeDocument/2006/relationships" xmlns:m="http://schemas.openxmlformats.org/officeDocument/2006/math" xmlns:v="urn:schemas-microsoft-com:vml" xmlns:wp14="http://schemas.microsoft.com/office/word/2010/wordprocessingDrawing" xmlns:wp="http://schemas.openxmlformats.org/drawingml/2006/wordprocessingDrawing" xmlns:w10="urn:schemas-microsoft-com:office:word" xmlns:w="http://schemas.openxmlformats.org/wordprocessingml/2006/main" xmlns:w14="http://schemas.microsoft.com/office/word/2010/wordml" xmlns:w15="http://schemas.microsoft.com/office/word/2012/wordml" xmlns:w16cex="http://schemas.microsoft.com/office/word/2018/wordml/cex" xmlns:w16cid="http://schemas.microsoft.com/office/word/2016/wordml/cid" xmlns:w16="http://schemas.microsoft.com/office/word/2018/wordml" xmlns:w16du="http://schemas.microsoft.com/office/word/2023/wordml/word16du" xmlns:w16sdtdh="http://schemas.microsoft.com/office/word/2020/wordml/sdtdatahash" xmlns:w16sdtfl="http://schemas.microsoft.com/office/word/2024/wordml/sdtformatlock" xmlns:w16se="http://schemas.microsoft.com/office/word/2015/wordml/symex" xmlns:wpg="http://schemas.microsoft.com/office/word/2010/wordprocessingGroup" xmlns:wpi="http://schemas.microsoft.com/office/word/2010/wordprocessingInk" xmlns:wne="http://schemas.microsoft.com/office/word/2006/wordml" xmlns:wps="http://schemas.microsoft.com/office/word/2010/wordprocessingShape" mc:Ignorable="w14 w15 w16se w16cid w16 w16cex w16sdtdh w16sdtfl w16du wp14">
   <w:footnote w:type="separator" w:id="-1">
     <w:p>
       <w:pPr>
@@ -3321,7 +3321,7 @@
 </file>
 
 <file path=word/header1.xml><?xml version="1.0" encoding="utf-8"?>
-<w:hdr xmlns:wpc="http://schemas.microsoft.com/office/word/2010/wordprocessingCanvas" xmlns:cx="http://schemas.microsoft.com/office/drawing/2014/chartex" xmlns:cx1="http://schemas.microsoft.com/office/drawing/2015/9/8/chartex" xmlns:cx2="http://schemas.microsoft.com/office/drawing/2015/10/21/chartex" xmlns:cx3="http://schemas.microsoft.com/office/drawing/2016/5/9/chartex" xmlns:cx4="http://schemas.microsoft.com/office/drawing/2016/5/10/chartex" xmlns:cx5="http://schemas.microsoft.com/office/drawing/2016/5/11/chartex" xmlns:cx6="http://schemas.microsoft.com/office/drawing/2016/5/12/chartex" xmlns:cx7="http://schemas.microsoft.com/office/drawing/2016/5/13/chartex" xmlns:cx8="http://schemas.microsoft.com/office/drawing/2016/5/14/chartex" xmlns:mc="http://schemas.openxmlformats.org/markup-compatibility/2006" xmlns:aink="http://schemas.microsoft.com/office/drawing/2016/ink" xmlns:am3d="http://schemas.microsoft.com/office/drawing/2017/model3d" xmlns:o="urn:schemas-microsoft-com:office:office" xmlns:oel="http://schemas.microsoft.com/office/2019/extlst" xmlns:r="http://schemas.openxmlformats.org/officeDocument/2006/relationships" xmlns:m="http://schemas.openxmlformats.org/officeDocument/2006/math" xmlns:v="urn:schemas-microsoft-com:vml" xmlns:wp14="http://schemas.microsoft.com/office/word/2010/wordprocessingDrawing" xmlns:wp="http://schemas.openxmlformats.org/drawingml/2006/wordprocessingDrawing" xmlns:w10="urn:schemas-microsoft-com:office:word" xmlns:w="http://schemas.openxmlformats.org/wordprocessingml/2006/main" xmlns:w14="http://schemas.microsoft.com/office/word/2010/wordml" xmlns:w15="http://schemas.microsoft.com/office/word/2012/wordml" xmlns:w16cex="http://schemas.microsoft.com/office/word/2018/wordml/cex" xmlns:w16cid="http://schemas.microsoft.com/office/word/2016/wordml/cid" xmlns:w16="http://schemas.microsoft.com/office/word/2018/wordml" xmlns:w16sdtdh="http://schemas.microsoft.com/office/word/2020/wordml/sdtdatahash" xmlns:w16se="http://schemas.microsoft.com/office/word/2015/wordml/symex" xmlns:wpg="http://schemas.microsoft.com/office/word/2010/wordprocessingGroup" xmlns:wpi="http://schemas.microsoft.com/office/word/2010/wordprocessingInk" xmlns:wne="http://schemas.microsoft.com/office/word/2006/wordml" xmlns:wps="http://schemas.microsoft.com/office/word/2010/wordprocessingShape" mc:Ignorable="w14 w15 w16se w16cid w16 w16cex w16sdtdh wp14">
+<w:hdr xmlns:wpc="http://schemas.microsoft.com/office/word/2010/wordprocessingCanvas" xmlns:cx="http://schemas.microsoft.com/office/drawing/2014/chartex" xmlns:cx1="http://schemas.microsoft.com/office/drawing/2015/9/8/chartex" xmlns:cx2="http://schemas.microsoft.com/office/drawing/2015/10/21/chartex" xmlns:cx3="http://schemas.microsoft.com/office/drawing/2016/5/9/chartex" xmlns:cx4="http://schemas.microsoft.com/office/drawing/2016/5/10/chartex" xmlns:cx5="http://schemas.microsoft.com/office/drawing/2016/5/11/chartex" xmlns:cx6="http://schemas.microsoft.com/office/drawing/2016/5/12/chartex" xmlns:cx7="http://schemas.microsoft.com/office/drawing/2016/5/13/chartex" xmlns:cx8="http://schemas.microsoft.com/office/drawing/2016/5/14/chartex" xmlns:mc="http://schemas.openxmlformats.org/markup-compatibility/2006" xmlns:aink="http://schemas.microsoft.com/office/drawing/2016/ink" xmlns:am3d="http://schemas.microsoft.com/office/drawing/2017/model3d" xmlns:o="urn:schemas-microsoft-com:office:office" xmlns:oel="http://schemas.microsoft.com/office/2019/extlst" xmlns:r="http://schemas.openxmlformats.org/officeDocument/2006/relationships" xmlns:m="http://schemas.openxmlformats.org/officeDocument/2006/math" xmlns:v="urn:schemas-microsoft-com:vml" xmlns:wp14="http://schemas.microsoft.com/office/word/2010/wordprocessingDrawing" xmlns:wp="http://schemas.openxmlformats.org/drawingml/2006/wordprocessingDrawing" xmlns:w10="urn:schemas-microsoft-com:office:word" xmlns:w="http://schemas.openxmlformats.org/wordprocessingml/2006/main" xmlns:w14="http://schemas.microsoft.com/office/word/2010/wordml" xmlns:w15="http://schemas.microsoft.com/office/word/2012/wordml" xmlns:w16cex="http://schemas.microsoft.com/office/word/2018/wordml/cex" xmlns:w16cid="http://schemas.microsoft.com/office/word/2016/wordml/cid" xmlns:w16="http://schemas.microsoft.com/office/word/2018/wordml" xmlns:w16du="http://schemas.microsoft.com/office/word/2023/wordml/word16du" xmlns:w16sdtdh="http://schemas.microsoft.com/office/word/2020/wordml/sdtdatahash" xmlns:w16sdtfl="http://schemas.microsoft.com/office/word/2024/wordml/sdtformatlock" xmlns:w16se="http://schemas.microsoft.com/office/word/2015/wordml/symex" xmlns:wpg="http://schemas.microsoft.com/office/word/2010/wordprocessingGroup" xmlns:wpi="http://schemas.microsoft.com/office/word/2010/wordprocessingInk" xmlns:wne="http://schemas.microsoft.com/office/word/2006/wordml" xmlns:wps="http://schemas.microsoft.com/office/word/2010/wordprocessingShape" mc:Ignorable="w14 w15 w16se w16cid w16 w16cex w16sdtdh w16sdtfl w16du wp14">
   <w:p>
     <w:pPr>
       <w:pStyle w:val="Header"/>
@@ -3331,7 +3331,7 @@
 </file>
 
 <file path=word/header2.xml><?xml version="1.0" encoding="utf-8"?>
-<w:hdr xmlns:wpc="http://schemas.microsoft.com/office/word/2010/wordprocessingCanvas" xmlns:cx="http://schemas.microsoft.com/office/drawing/2014/chartex" xmlns:cx1="http://schemas.microsoft.com/office/drawing/2015/9/8/chartex" xmlns:cx2="http://schemas.microsoft.com/office/drawing/2015/10/21/chartex" xmlns:cx3="http://schemas.microsoft.com/office/drawing/2016/5/9/chartex" xmlns:cx4="http://schemas.microsoft.com/office/drawing/2016/5/10/chartex" xmlns:cx5="http://schemas.microsoft.com/office/drawing/2016/5/11/chartex" xmlns:cx6="http://schemas.microsoft.com/office/drawing/2016/5/12/chartex" xmlns:cx7="http://schemas.microsoft.com/office/drawing/2016/5/13/chartex" xmlns:cx8="http://schemas.microsoft.com/office/drawing/2016/5/14/chartex" xmlns:mc="http://schemas.openxmlformats.org/markup-compatibility/2006" xmlns:aink="http://schemas.microsoft.com/office/drawing/2016/ink" xmlns:am3d="http://schemas.microsoft.com/office/drawing/2017/model3d" xmlns:o="urn:schemas-microsoft-com:office:office" xmlns:oel="http://schemas.microsoft.com/office/2019/extlst" xmlns:r="http://schemas.openxmlformats.org/officeDocument/2006/relationships" xmlns:m="http://schemas.openxmlformats.org/officeDocument/2006/math" xmlns:v="urn:schemas-microsoft-com:vml" xmlns:wp14="http://schemas.microsoft.com/office/word/2010/wordprocessingDrawing" xmlns:wp="http://schemas.openxmlformats.org/drawingml/2006/wordprocessingDrawing" xmlns:w10="urn:schemas-microsoft-com:office:word" xmlns:w="http://schemas.openxmlformats.org/wordprocessingml/2006/main" xmlns:w14="http://schemas.microsoft.com/office/word/2010/wordml" xmlns:w15="http://schemas.microsoft.com/office/word/2012/wordml" xmlns:w16cex="http://schemas.microsoft.com/office/word/2018/wordml/cex" xmlns:w16cid="http://schemas.microsoft.com/office/word/2016/wordml/cid" xmlns:w16="http://schemas.microsoft.com/office/word/2018/wordml" xmlns:w16sdtdh="http://schemas.microsoft.com/office/word/2020/wordml/sdtdatahash" xmlns:w16se="http://schemas.microsoft.com/office/word/2015/wordml/symex" xmlns:wpg="http://schemas.microsoft.com/office/word/2010/wordprocessingGroup" xmlns:wpi="http://schemas.microsoft.com/office/word/2010/wordprocessingInk" xmlns:wne="http://schemas.microsoft.com/office/word/2006/wordml" xmlns:wps="http://schemas.microsoft.com/office/word/2010/wordprocessingShape" mc:Ignorable="w14 w15 w16se w16cid w16 w16cex w16sdtdh wp14">
+<w:hdr xmlns:wpc="http://schemas.microsoft.com/office/word/2010/wordprocessingCanvas" xmlns:cx="http://schemas.microsoft.com/office/drawing/2014/chartex" xmlns:cx1="http://schemas.microsoft.com/office/drawing/2015/9/8/chartex" xmlns:cx2="http://schemas.microsoft.com/office/drawing/2015/10/21/chartex" xmlns:cx3="http://schemas.microsoft.com/office/drawing/2016/5/9/chartex" xmlns:cx4="http://schemas.microsoft.com/office/drawing/2016/5/10/chartex" xmlns:cx5="http://schemas.microsoft.com/office/drawing/2016/5/11/chartex" xmlns:cx6="http://schemas.microsoft.com/office/drawing/2016/5/12/chartex" xmlns:cx7="http://schemas.microsoft.com/office/drawing/2016/5/13/chartex" xmlns:cx8="http://schemas.microsoft.com/office/drawing/2016/5/14/chartex" xmlns:mc="http://schemas.openxmlformats.org/markup-compatibility/2006" xmlns:aink="http://schemas.microsoft.com/office/drawing/2016/ink" xmlns:am3d="http://schemas.microsoft.com/office/drawing/2017/model3d" xmlns:o="urn:schemas-microsoft-com:office:office" xmlns:oel="http://schemas.microsoft.com/office/2019/extlst" xmlns:r="http://schemas.openxmlformats.org/officeDocument/2006/relationships" xmlns:m="http://schemas.openxmlformats.org/officeDocument/2006/math" xmlns:v="urn:schemas-microsoft-com:vml" xmlns:wp14="http://schemas.microsoft.com/office/word/2010/wordprocessingDrawing" xmlns:wp="http://schemas.openxmlformats.org/drawingml/2006/wordprocessingDrawing" xmlns:w10="urn:schemas-microsoft-com:office:word" xmlns:w="http://schemas.openxmlformats.org/wordprocessingml/2006/main" xmlns:w14="http://schemas.microsoft.com/office/word/2010/wordml" xmlns:w15="http://schemas.microsoft.com/office/word/2012/wordml" xmlns:w16cex="http://schemas.microsoft.com/office/word/2018/wordml/cex" xmlns:w16cid="http://schemas.microsoft.com/office/word/2016/wordml/cid" xmlns:w16="http://schemas.microsoft.com/office/word/2018/wordml" xmlns:w16du="http://schemas.microsoft.com/office/word/2023/wordml/word16du" xmlns:w16sdtdh="http://schemas.microsoft.com/office/word/2020/wordml/sdtdatahash" xmlns:w16sdtfl="http://schemas.microsoft.com/office/word/2024/wordml/sdtformatlock" xmlns:w16se="http://schemas.microsoft.com/office/word/2015/wordml/symex" xmlns:wpg="http://schemas.microsoft.com/office/word/2010/wordprocessingGroup" xmlns:wpi="http://schemas.microsoft.com/office/word/2010/wordprocessingInk" xmlns:wne="http://schemas.microsoft.com/office/word/2006/wordml" xmlns:wps="http://schemas.microsoft.com/office/word/2010/wordprocessingShape" mc:Ignorable="w14 w15 w16se w16cid w16 w16cex w16sdtdh w16sdtfl w16du wp14">
   <w:p>
     <w:pPr>
       <w:pStyle w:val="Header"/>
@@ -3341,7 +3341,7 @@
 </file>
 
 <file path=word/header3.xml><?xml version="1.0" encoding="utf-8"?>
-<w:hdr xmlns:wpc="http://schemas.microsoft.com/office/word/2010/wordprocessingCanvas" xmlns:cx="http://schemas.microsoft.com/office/drawing/2014/chartex" xmlns:cx1="http://schemas.microsoft.com/office/drawing/2015/9/8/chartex" xmlns:cx2="http://schemas.microsoft.com/office/drawing/2015/10/21/chartex" xmlns:cx3="http://schemas.microsoft.com/office/drawing/2016/5/9/chartex" xmlns:cx4="http://schemas.microsoft.com/office/drawing/2016/5/10/chartex" xmlns:cx5="http://schemas.microsoft.com/office/drawing/2016/5/11/chartex" xmlns:cx6="http://schemas.microsoft.com/office/drawing/2016/5/12/chartex" xmlns:cx7="http://schemas.microsoft.com/office/drawing/2016/5/13/chartex" xmlns:cx8="http://schemas.microsoft.com/office/drawing/2016/5/14/chartex" xmlns:mc="http://schemas.openxmlformats.org/markup-compatibility/2006" xmlns:aink="http://schemas.microsoft.com/office/drawing/2016/ink" xmlns:am3d="http://schemas.microsoft.com/office/drawing/2017/model3d" xmlns:o="urn:schemas-microsoft-com:office:office" xmlns:oel="http://schemas.microsoft.com/office/2019/extlst" xmlns:r="http://schemas.openxmlformats.org/officeDocument/2006/relationships" xmlns:m="http://schemas.openxmlformats.org/officeDocument/2006/math" xmlns:v="urn:schemas-microsoft-com:vml" xmlns:wp14="http://schemas.microsoft.com/office/word/2010/wordprocessingDrawing" xmlns:wp="http://schemas.openxmlformats.org/drawingml/2006/wordprocessingDrawing" xmlns:w10="urn:schemas-microsoft-com:office:word" xmlns:w="http://schemas.openxmlformats.org/wordprocessingml/2006/main" xmlns:w14="http://schemas.microsoft.com/office/word/2010/wordml" xmlns:w15="http://schemas.microsoft.com/office/word/2012/wordml" xmlns:w16cex="http://schemas.microsoft.com/office/word/2018/wordml/cex" xmlns:w16cid="http://schemas.microsoft.com/office/word/2016/wordml/cid" xmlns:w16="http://schemas.microsoft.com/office/word/2018/wordml" xmlns:w16sdtdh="http://schemas.microsoft.com/office/word/2020/wordml/sdtdatahash" xmlns:w16se="http://schemas.microsoft.com/office/word/2015/wordml/symex" xmlns:wpg="http://schemas.microsoft.com/office/word/2010/wordprocessingGroup" xmlns:wpi="http://schemas.microsoft.com/office/word/2010/wordprocessingInk" xmlns:wne="http://schemas.microsoft.com/office/word/2006/wordml" xmlns:wps="http://schemas.microsoft.com/office/word/2010/wordprocessingShape" mc:Ignorable="w14 w15 w16se w16cid w16 w16cex w16sdtdh wp14">
+<w:hdr xmlns:wpc="http://schemas.microsoft.com/office/word/2010/wordprocessingCanvas" xmlns:cx="http://schemas.microsoft.com/office/drawing/2014/chartex" xmlns:cx1="http://schemas.microsoft.com/office/drawing/2015/9/8/chartex" xmlns:cx2="http://schemas.microsoft.com/office/drawing/2015/10/21/chartex" xmlns:cx3="http://schemas.microsoft.com/office/drawing/2016/5/9/chartex" xmlns:cx4="http://schemas.microsoft.com/office/drawing/2016/5/10/chartex" xmlns:cx5="http://schemas.microsoft.com/office/drawing/2016/5/11/chartex" xmlns:cx6="http://schemas.microsoft.com/office/drawing/2016/5/12/chartex" xmlns:cx7="http://schemas.microsoft.com/office/drawing/2016/5/13/chartex" xmlns:cx8="http://schemas.microsoft.com/office/drawing/2016/5/14/chartex" xmlns:mc="http://schemas.openxmlformats.org/markup-compatibility/2006" xmlns:aink="http://schemas.microsoft.com/office/drawing/2016/ink" xmlns:am3d="http://schemas.microsoft.com/office/drawing/2017/model3d" xmlns:o="urn:schemas-microsoft-com:office:office" xmlns:oel="http://schemas.microsoft.com/office/2019/extlst" xmlns:r="http://schemas.openxmlformats.org/officeDocument/2006/relationships" xmlns:m="http://schemas.openxmlformats.org/officeDocument/2006/math" xmlns:v="urn:schemas-microsoft-com:vml" xmlns:wp14="http://schemas.microsoft.com/office/word/2010/wordprocessingDrawing" xmlns:wp="http://schemas.openxmlformats.org/drawingml/2006/wordprocessingDrawing" xmlns:w10="urn:schemas-microsoft-com:office:word" xmlns:w="http://schemas.openxmlformats.org/wordprocessingml/2006/main" xmlns:w14="http://schemas.microsoft.com/office/word/2010/wordml" xmlns:w15="http://schemas.microsoft.com/office/word/2012/wordml" xmlns:w16cex="http://schemas.microsoft.com/office/word/2018/wordml/cex" xmlns:w16cid="http://schemas.microsoft.com/office/word/2016/wordml/cid" xmlns:w16="http://schemas.microsoft.com/office/word/2018/wordml" xmlns:w16du="http://schemas.microsoft.com/office/word/2023/wordml/word16du" xmlns:w16sdtdh="http://schemas.microsoft.com/office/word/2020/wordml/sdtdatahash" xmlns:w16sdtfl="http://schemas.microsoft.com/office/word/2024/wordml/sdtformatlock" xmlns:w16se="http://schemas.microsoft.com/office/word/2015/wordml/symex" xmlns:wpg="http://schemas.microsoft.com/office/word/2010/wordprocessingGroup" xmlns:wpi="http://schemas.microsoft.com/office/word/2010/wordprocessingInk" xmlns:wne="http://schemas.microsoft.com/office/word/2006/wordml" xmlns:wps="http://schemas.microsoft.com/office/word/2010/wordprocessingShape" mc:Ignorable="w14 w15 w16se w16cid w16 w16cex w16sdtdh w16sdtfl w16du wp14">
   <w:p>
     <w:pPr>
       <w:pStyle w:val="Header"/>
@@ -3351,7 +3351,7 @@
 </file>
 
 <file path=word/numbering.xml><?xml version="1.0" encoding="utf-8"?>
-<w:numbering xmlns:wpc="http://schemas.microsoft.com/office/word/2010/wordprocessingCanvas" xmlns:cx="http://schemas.microsoft.com/office/drawing/2014/chartex" xmlns:cx1="http://schemas.microsoft.com/office/drawing/2015/9/8/chartex" xmlns:cx2="http://schemas.microsoft.com/office/drawing/2015/10/21/chartex" xmlns:cx3="http://schemas.microsoft.com/office/drawing/2016/5/9/chartex" xmlns:cx4="http://schemas.microsoft.com/office/drawing/2016/5/10/chartex" xmlns:cx5="http://schemas.microsoft.com/office/drawing/2016/5/11/chartex" xmlns:cx6="http://schemas.microsoft.com/office/drawing/2016/5/12/chartex" xmlns:cx7="http://schemas.microsoft.com/office/drawing/2016/5/13/chartex" xmlns:cx8="http://schemas.microsoft.com/office/drawing/2016/5/14/chartex" xmlns:mc="http://schemas.openxmlformats.org/markup-compatibility/2006" xmlns:aink="http://schemas.microsoft.com/office/drawing/2016/ink" xmlns:am3d="http://schemas.microsoft.com/office/drawing/2017/model3d" xmlns:o="urn:schemas-microsoft-com:office:office" xmlns:oel="http://schemas.microsoft.com/office/2019/extlst" xmlns:r="http://schemas.openxmlformats.org/officeDocument/2006/relationships" xmlns:m="http://schemas.openxmlformats.org/officeDocument/2006/math" xmlns:v="urn:schemas-microsoft-com:vml" xmlns:wp14="http://schemas.microsoft.com/office/word/2010/wordprocessingDrawing" xmlns:wp="http://schemas.openxmlformats.org/drawingml/2006/wordprocessingDrawing" xmlns:w10="urn:schemas-microsoft-com:office:word" xmlns:w="http://schemas.openxmlformats.org/wordprocessingml/2006/main" xmlns:w14="http://schemas.microsoft.com/office/word/2010/wordml" xmlns:w15="http://schemas.microsoft.com/office/word/2012/wordml" xmlns:w16cex="http://schemas.microsoft.com/office/word/2018/wordml/cex" xmlns:w16cid="http://schemas.microsoft.com/office/word/2016/wordml/cid" xmlns:w16="http://schemas.microsoft.com/office/word/2018/wordml" xmlns:w16sdtdh="http://schemas.microsoft.com/office/word/2020/wordml/sdtdatahash" xmlns:w16se="http://schemas.microsoft.com/office/word/2015/wordml/symex" xmlns:wpg="http://schemas.microsoft.com/office/word/2010/wordprocessingGroup" xmlns:wpi="http://schemas.microsoft.com/office/word/2010/wordprocessingInk" xmlns:wne="http://schemas.microsoft.com/office/word/2006/wordml" xmlns:wps="http://schemas.microsoft.com/office/word/2010/wordprocessingShape" mc:Ignorable="w14 w15 w16se w16cid w16 w16cex w16sdtdh wp14">
+<w:numbering xmlns:wpc="http://schemas.microsoft.com/office/word/2010/wordprocessingCanvas" xmlns:cx="http://schemas.microsoft.com/office/drawing/2014/chartex" xmlns:cx1="http://schemas.microsoft.com/office/drawing/2015/9/8/chartex" xmlns:cx2="http://schemas.microsoft.com/office/drawing/2015/10/21/chartex" xmlns:cx3="http://schemas.microsoft.com/office/drawing/2016/5/9/chartex" xmlns:cx4="http://schemas.microsoft.com/office/drawing/2016/5/10/chartex" xmlns:cx5="http://schemas.microsoft.com/office/drawing/2016/5/11/chartex" xmlns:cx6="http://schemas.microsoft.com/office/drawing/2016/5/12/chartex" xmlns:cx7="http://schemas.microsoft.com/office/drawing/2016/5/13/chartex" xmlns:cx8="http://schemas.microsoft.com/office/drawing/2016/5/14/chartex" xmlns:mc="http://schemas.openxmlformats.org/markup-compatibility/2006" xmlns:aink="http://schemas.microsoft.com/office/drawing/2016/ink" xmlns:am3d="http://schemas.microsoft.com/office/drawing/2017/model3d" xmlns:o="urn:schemas-microsoft-com:office:office" xmlns:oel="http://schemas.microsoft.com/office/2019/extlst" xmlns:r="http://schemas.openxmlformats.org/officeDocument/2006/relationships" xmlns:m="http://schemas.openxmlformats.org/officeDocument/2006/math" xmlns:v="urn:schemas-microsoft-com:vml" xmlns:wp14="http://schemas.microsoft.com/office/word/2010/wordprocessingDrawing" xmlns:wp="http://schemas.openxmlformats.org/drawingml/2006/wordprocessingDrawing" xmlns:w10="urn:schemas-microsoft-com:office:word" xmlns:w="http://schemas.openxmlformats.org/wordprocessingml/2006/main" xmlns:w14="http://schemas.microsoft.com/office/word/2010/wordml" xmlns:w15="http://schemas.microsoft.com/office/word/2012/wordml" xmlns:w16cex="http://schemas.microsoft.com/office/word/2018/wordml/cex" xmlns:w16cid="http://schemas.microsoft.com/office/word/2016/wordml/cid" xmlns:w16="http://schemas.microsoft.com/office/word/2018/wordml" xmlns:w16du="http://schemas.microsoft.com/office/word/2023/wordml/word16du" xmlns:w16sdtdh="http://schemas.microsoft.com/office/word/2020/wordml/sdtdatahash" xmlns:w16sdtfl="http://schemas.microsoft.com/office/word/2024/wordml/sdtformatlock" xmlns:w16se="http://schemas.microsoft.com/office/word/2015/wordml/symex" xmlns:wpg="http://schemas.microsoft.com/office/word/2010/wordprocessingGroup" xmlns:wpi="http://schemas.microsoft.com/office/word/2010/wordprocessingInk" xmlns:wne="http://schemas.microsoft.com/office/word/2006/wordml" xmlns:wps="http://schemas.microsoft.com/office/word/2010/wordprocessingShape" mc:Ignorable="w14 w15 w16se w16cid w16 w16cex w16sdtdh w16sdtfl w16du wp14">
   <w:abstractNum w:abstractNumId="0" w15:restartNumberingAfterBreak="0">
     <w:nsid w:val="07224A6B"/>
     <w:multiLevelType w:val="hybridMultilevel"/>
@@ -4255,7 +4255,7 @@
 </file>
 
 <file path=word/people.xml><?xml version="1.0" encoding="utf-8"?>
-<w15:people xmlns:wpc="http://schemas.microsoft.com/office/word/2010/wordprocessingCanvas" xmlns:cx="http://schemas.microsoft.com/office/drawing/2014/chartex" xmlns:cx1="http://schemas.microsoft.com/office/drawing/2015/9/8/chartex" xmlns:cx2="http://schemas.microsoft.com/office/drawing/2015/10/21/chartex" xmlns:cx3="http://schemas.microsoft.com/office/drawing/2016/5/9/chartex" xmlns:cx4="http://schemas.microsoft.com/office/drawing/2016/5/10/chartex" xmlns:cx5="http://schemas.microsoft.com/office/drawing/2016/5/11/chartex" xmlns:cx6="http://schemas.microsoft.com/office/drawing/2016/5/12/chartex" xmlns:cx7="http://schemas.microsoft.com/office/drawing/2016/5/13/chartex" xmlns:cx8="http://schemas.microsoft.com/office/drawing/2016/5/14/chartex" xmlns:mc="http://schemas.openxmlformats.org/markup-compatibility/2006" xmlns:aink="http://schemas.microsoft.com/office/drawing/2016/ink" xmlns:am3d="http://schemas.microsoft.com/office/drawing/2017/model3d" xmlns:o="urn:schemas-microsoft-com:office:office" xmlns:oel="http://schemas.microsoft.com/office/2019/extlst" xmlns:r="http://schemas.openxmlformats.org/officeDocument/2006/relationships" xmlns:m="http://schemas.openxmlformats.org/officeDocument/2006/math" xmlns:v="urn:schemas-microsoft-com:vml" xmlns:wp14="http://schemas.microsoft.com/office/word/2010/wordprocessingDrawing" xmlns:wp="http://schemas.openxmlformats.org/drawingml/2006/wordprocessingDrawing" xmlns:w10="urn:schemas-microsoft-com:office:word" xmlns:w="http://schemas.openxmlformats.org/wordprocessingml/2006/main" xmlns:w14="http://schemas.microsoft.com/office/word/2010/wordml" xmlns:w15="http://schemas.microsoft.com/office/word/2012/wordml" xmlns:w16cex="http://schemas.microsoft.com/office/word/2018/wordml/cex" xmlns:w16cid="http://schemas.microsoft.com/office/word/2016/wordml/cid" xmlns:w16="http://schemas.microsoft.com/office/word/2018/wordml" xmlns:w16sdtdh="http://schemas.microsoft.com/office/word/2020/wordml/sdtdatahash" xmlns:w16se="http://schemas.microsoft.com/office/word/2015/wordml/symex" xmlns:wpg="http://schemas.microsoft.com/office/word/2010/wordprocessingGroup" xmlns:wpi="http://schemas.microsoft.com/office/word/2010/wordprocessingInk" xmlns:wne="http://schemas.microsoft.com/office/word/2006/wordml" xmlns:wps="http://schemas.microsoft.com/office/word/2010/wordprocessingShape" mc:Ignorable="w14 w15 w16se w16cid w16 w16cex w16sdtdh wp14">
+<w15:people xmlns:wpc="http://schemas.microsoft.com/office/word/2010/wordprocessingCanvas" xmlns:cx="http://schemas.microsoft.com/office/drawing/2014/chartex" xmlns:cx1="http://schemas.microsoft.com/office/drawing/2015/9/8/chartex" xmlns:cx2="http://schemas.microsoft.com/office/drawing/2015/10/21/chartex" xmlns:cx3="http://schemas.microsoft.com/office/drawing/2016/5/9/chartex" xmlns:cx4="http://schemas.microsoft.com/office/drawing/2016/5/10/chartex" xmlns:cx5="http://schemas.microsoft.com/office/drawing/2016/5/11/chartex" xmlns:cx6="http://schemas.microsoft.com/office/drawing/2016/5/12/chartex" xmlns:cx7="http://schemas.microsoft.com/office/drawing/2016/5/13/chartex" xmlns:cx8="http://schemas.microsoft.com/office/drawing/2016/5/14/chartex" xmlns:mc="http://schemas.openxmlformats.org/markup-compatibility/2006" xmlns:aink="http://schemas.microsoft.com/office/drawing/2016/ink" xmlns:am3d="http://schemas.microsoft.com/office/drawing/2017/model3d" xmlns:o="urn:schemas-microsoft-com:office:office" xmlns:oel="http://schemas.microsoft.com/office/2019/extlst" xmlns:r="http://schemas.openxmlformats.org/officeDocument/2006/relationships" xmlns:m="http://schemas.openxmlformats.org/officeDocument/2006/math" xmlns:v="urn:schemas-microsoft-com:vml" xmlns:wp14="http://schemas.microsoft.com/office/word/2010/wordprocessingDrawing" xmlns:wp="http://schemas.openxmlformats.org/drawingml/2006/wordprocessingDrawing" xmlns:w10="urn:schemas-microsoft-com:office:word" xmlns:w="http://schemas.openxmlformats.org/wordprocessingml/2006/main" xmlns:w14="http://schemas.microsoft.com/office/word/2010/wordml" xmlns:w15="http://schemas.microsoft.com/office/word/2012/wordml" xmlns:w16cex="http://schemas.microsoft.com/office/word/2018/wordml/cex" xmlns:w16cid="http://schemas.microsoft.com/office/word/2016/wordml/cid" xmlns:w16="http://schemas.microsoft.com/office/word/2018/wordml" xmlns:w16du="http://schemas.microsoft.com/office/word/2023/wordml/word16du" xmlns:w16sdtdh="http://schemas.microsoft.com/office/word/2020/wordml/sdtdatahash" xmlns:w16sdtfl="http://schemas.microsoft.com/office/word/2024/wordml/sdtformatlock" xmlns:w16se="http://schemas.microsoft.com/office/word/2015/wordml/symex" xmlns:wpg="http://schemas.microsoft.com/office/word/2010/wordprocessingGroup" xmlns:wpi="http://schemas.microsoft.com/office/word/2010/wordprocessingInk" xmlns:wne="http://schemas.microsoft.com/office/word/2006/wordml" xmlns:wps="http://schemas.microsoft.com/office/word/2010/wordprocessingShape" mc:Ignorable="w14 w15 w16se w16cid w16 w16cex w16sdtdh w16sdtfl w16du wp14">
   <w15:person w15:author="Tammy Enns">
     <w15:presenceInfo w15:providerId="AD" w15:userId="S::tammy_enns@wycliffeassociates.org::2ab698fd-6bb7-40f1-b849-74fe330cf16d"/>
   </w15:person>
@@ -4263,7 +4263,7 @@
 </file>
 
 <file path=word/styles.xml><?xml version="1.0" encoding="utf-8"?>
-<w:styles xmlns:mc="http://schemas.openxmlformats.org/markup-compatibility/2006" xmlns:r="http://schemas.openxmlformats.org/officeDocument/2006/relationships" xmlns:w="http://schemas.openxmlformats.org/wordprocessingml/2006/main" xmlns:w14="http://schemas.microsoft.com/office/word/2010/wordml" xmlns:w15="http://schemas.microsoft.com/office/word/2012/wordml" xmlns:w16cex="http://schemas.microsoft.com/office/word/2018/wordml/cex" xmlns:w16cid="http://schemas.microsoft.com/office/word/2016/wordml/cid" xmlns:w16="http://schemas.microsoft.com/office/word/2018/wordml" xmlns:w16sdtdh="http://schemas.microsoft.com/office/word/2020/wordml/sdtdatahash" xmlns:w16se="http://schemas.microsoft.com/office/word/2015/wordml/symex" mc:Ignorable="w14 w15 w16se w16cid w16 w16cex w16sdtdh">
+<w:styles xmlns:mc="http://schemas.openxmlformats.org/markup-compatibility/2006" xmlns:r="http://schemas.openxmlformats.org/officeDocument/2006/relationships" xmlns:w="http://schemas.openxmlformats.org/wordprocessingml/2006/main" xmlns:w14="http://schemas.microsoft.com/office/word/2010/wordml" xmlns:w15="http://schemas.microsoft.com/office/word/2012/wordml" xmlns:w16cex="http://schemas.microsoft.com/office/word/2018/wordml/cex" xmlns:w16cid="http://schemas.microsoft.com/office/word/2016/wordml/cid" xmlns:w16="http://schemas.microsoft.com/office/word/2018/wordml" xmlns:w16du="http://schemas.microsoft.com/office/word/2023/wordml/word16du" xmlns:w16sdtdh="http://schemas.microsoft.com/office/word/2020/wordml/sdtdatahash" xmlns:w16sdtfl="http://schemas.microsoft.com/office/word/2024/wordml/sdtformatlock" xmlns:w16se="http://schemas.microsoft.com/office/word/2015/wordml/symex" mc:Ignorable="w14 w15 w16se w16cid w16 w16cex w16sdtdh w16sdtfl w16du">
   <w:docDefaults>
     <w:rPrDefault>
       <w:rPr>
@@ -5122,8 +5122,8 @@
 </file>
 
 <file path=customXml/item1.xml><?xml version="1.0" encoding="utf-8"?>
-<ct:contentTypeSchema xmlns:ct="http://schemas.microsoft.com/office/2006/metadata/contentType" xmlns:ma="http://schemas.microsoft.com/office/2006/metadata/properties/metaAttributes" ct:_="" ma:_="" ma:contentTypeName="Document" ma:contentTypeID="0x0101002F017C5ECD5AE84588140775F5D9B6FC" ma:contentTypeVersion="9" ma:contentTypeDescription="Create a new document." ma:contentTypeScope="" ma:versionID="8ee0fe59cacb1f41a9e66ec0fc8b16cd">
-  <xsd:schema xmlns:xsd="http://www.w3.org/2001/XMLSchema" xmlns:xs="http://www.w3.org/2001/XMLSchema" xmlns:p="http://schemas.microsoft.com/office/2006/metadata/properties" xmlns:ns2="fee82e44-1fa4-4144-8309-00fed2bf4198" xmlns:ns3="1a61c928-f5f6-4989-bd5d-cb8872a1b06d" targetNamespace="http://schemas.microsoft.com/office/2006/metadata/properties" ma:root="true" ma:fieldsID="6b8f5e0ab863febec4bdf2d0bf2c5ecf" ns2:_="" ns3:_="">
+<ct:contentTypeSchema xmlns:ct="http://schemas.microsoft.com/office/2006/metadata/contentType" xmlns:ma="http://schemas.microsoft.com/office/2006/metadata/properties/metaAttributes" ct:_="" ma:_="" ma:contentTypeName="Document" ma:contentTypeID="0x0101002F017C5ECD5AE84588140775F5D9B6FC" ma:contentTypeVersion="10" ma:contentTypeDescription="Create a new document." ma:contentTypeScope="" ma:versionID="1a5380cb2be4a51461126b02f947e923">
+  <xsd:schema xmlns:xsd="http://www.w3.org/2001/XMLSchema" xmlns:xs="http://www.w3.org/2001/XMLSchema" xmlns:p="http://schemas.microsoft.com/office/2006/metadata/properties" xmlns:ns2="fee82e44-1fa4-4144-8309-00fed2bf4198" xmlns:ns3="1a61c928-f5f6-4989-bd5d-cb8872a1b06d" targetNamespace="http://schemas.microsoft.com/office/2006/metadata/properties" ma:root="true" ma:fieldsID="9bf58d68fa2085cb5739c341b0c4cacb" ns2:_="" ns3:_="">
     <xsd:import namespace="fee82e44-1fa4-4144-8309-00fed2bf4198"/>
     <xsd:import namespace="1a61c928-f5f6-4989-bd5d-cb8872a1b06d"/>
     <xsd:element name="properties">
@@ -5141,6 +5141,7 @@
                 <xsd:element ref="ns2:MediaServiceObjectDetectorVersions" minOccurs="0"/>
                 <xsd:element ref="ns2:MediaServiceGenerationTime" minOccurs="0"/>
                 <xsd:element ref="ns2:MediaServiceEventHashCode" minOccurs="0"/>
+                <xsd:element ref="ns2:MediaServiceSearchProperties" minOccurs="0"/>
               </xsd:all>
             </xsd:complexType>
           </xsd:element>
@@ -5184,6 +5185,11 @@
     <xsd:element name="MediaServiceEventHashCode" ma:index="16" nillable="true" ma:displayName="MediaServiceEventHashCode" ma:hidden="true" ma:internalName="MediaServiceEventHashCode" ma:readOnly="true">
       <xsd:simpleType>
         <xsd:restriction base="dms:Text"/>
+      </xsd:simpleType>
+    </xsd:element>
+    <xsd:element name="MediaServiceSearchProperties" ma:index="17" nillable="true" ma:displayName="MediaServiceSearchProperties" ma:hidden="true" ma:internalName="MediaServiceSearchProperties" ma:readOnly="true">
+      <xsd:simpleType>
+        <xsd:restriction base="dms:Note"/>
       </xsd:simpleType>
     </xsd:element>
   </xsd:schema>
@@ -5317,6 +5323,12 @@
 </file>
 
 <file path=customXml/item2.xml><?xml version="1.0" encoding="utf-8"?>
+<p:properties xmlns:p="http://schemas.microsoft.com/office/2006/metadata/properties" xmlns:xsi="http://www.w3.org/2001/XMLSchema-instance" xmlns:pc="http://schemas.microsoft.com/office/infopath/2007/PartnerControls">
+  <documentManagement/>
+</p:properties>
+</file>
+
+<file path=customXml/item3.xml><?xml version="1.0" encoding="utf-8"?>
 <?mso-contentType ?>
 <FormTemplates xmlns="http://schemas.microsoft.com/sharepoint/v3/contenttype/forms">
   <Display>DocumentLibraryForm</Display>
@@ -5325,20 +5337,23 @@
 </FormTemplates>
 </file>
 
-<file path=customXml/item3.xml><?xml version="1.0" encoding="utf-8"?>
-<p:properties xmlns:p="http://schemas.microsoft.com/office/2006/metadata/properties" xmlns:xsi="http://www.w3.org/2001/XMLSchema-instance" xmlns:pc="http://schemas.microsoft.com/office/infopath/2007/PartnerControls">
-  <documentManagement/>
-</p:properties>
-</file>
-
 <file path=customXml/itemProps1.xml><?xml version="1.0" encoding="utf-8"?>
-<ds:datastoreItem xmlns:ds="http://schemas.openxmlformats.org/officeDocument/2006/customXml" ds:itemID="{C7CCD5C9-6615-499D-A8DE-857BFEF7595A}"/>
+<ds:datastoreItem xmlns:ds="http://schemas.openxmlformats.org/officeDocument/2006/customXml" ds:itemID="{CEB9212B-98CC-456B-AF83-3EBD9310BA35}"/>
 </file>
 
 <file path=customXml/itemProps2.xml><?xml version="1.0" encoding="utf-8"?>
-<ds:datastoreItem xmlns:ds="http://schemas.openxmlformats.org/officeDocument/2006/customXml" ds:itemID="{CE6B5168-91E6-4532-8318-CB0118D2AFB3}"/>
+<ds:datastoreItem xmlns:ds="http://schemas.openxmlformats.org/officeDocument/2006/customXml" ds:itemID="{FF574CEE-81F4-4B78-8590-D43E9BEEFC17}">
+  <ds:schemaRefs>
+    <ds:schemaRef ds:uri="http://schemas.microsoft.com/office/2006/metadata/properties"/>
+    <ds:schemaRef ds:uri="http://schemas.microsoft.com/office/infopath/2007/PartnerControls"/>
+  </ds:schemaRefs>
+</ds:datastoreItem>
 </file>
 
 <file path=customXml/itemProps3.xml><?xml version="1.0" encoding="utf-8"?>
-<ds:datastoreItem xmlns:ds="http://schemas.openxmlformats.org/officeDocument/2006/customXml" ds:itemID="{FF574CEE-81F4-4B78-8590-D43E9BEEFC17}"/>
+<ds:datastoreItem xmlns:ds="http://schemas.openxmlformats.org/officeDocument/2006/customXml" ds:itemID="{CE6B5168-91E6-4532-8318-CB0118D2AFB3}">
+  <ds:schemaRefs>
+    <ds:schemaRef ds:uri="http://schemas.microsoft.com/sharepoint/v3/contenttype/forms"/>
+  </ds:schemaRefs>
+</ds:datastoreItem>
 </file>
</xml_diff>